<commit_message>
Refine review template generation
</commit_message>
<xml_diff>
--- a/templates/review_template.docx
+++ b/templates/review_template.docx
@@ -1,30 +1,1344 @@
 
 <file path=word/document.xml><?xml version="1.0" encoding="utf-8"?>
-<w:document xmlns:w="http://schemas.openxmlformats.org/wordprocessingml/2006/main" xmlns:mc="http://schemas.openxmlformats.org/markup-compatibility/2006" xmlns:w14="http://schemas.microsoft.com/office/word/2010/wordml" xmlns:w15="http://schemas.microsoft.com/office/word/2012/wordml" xmlns:w16se="http://schemas.microsoft.com/office/word/2015/wordml/symex" xmlns:wp14="http://schemas.microsoft.com/office/word/2010/wordprocessingDrawing" mc:Ignorable="w14 w15 w16se wp14">
+<w:document xmlns:wpc="http://schemas.microsoft.com/office/word/2010/wordprocessingCanvas" xmlns:cx="http://schemas.microsoft.com/office/drawing/2014/chartex" xmlns:mc="http://schemas.openxmlformats.org/markup-compatibility/2006" xmlns:o="urn:schemas-microsoft-com:office:office" xmlns:r="http://schemas.openxmlformats.org/officeDocument/2006/relationships" xmlns:m="http://schemas.openxmlformats.org/officeDocument/2006/math" xmlns:v="urn:schemas-microsoft-com:vml" xmlns:wp14="http://schemas.microsoft.com/office/word/2010/wordprocessingDrawing" xmlns:wp="http://schemas.openxmlformats.org/drawingml/2006/wordprocessingDrawing" xmlns:w10="urn:schemas-microsoft-com:office:word" xmlns:w="http://schemas.openxmlformats.org/wordprocessingml/2006/main" xmlns:w14="http://schemas.microsoft.com/office/word/2010/wordml" xmlns:w15="http://schemas.microsoft.com/office/word/2012/wordml" xmlns:w16se="http://schemas.microsoft.com/office/word/2015/wordml/symex" xmlns:wpg="http://schemas.microsoft.com/office/word/2010/wordprocessingGroup" xmlns:wpi="http://schemas.microsoft.com/office/word/2010/wordprocessingInk" xmlns:wne="http://schemas.microsoft.com/office/word/2006/wordml" xmlns:wps="http://schemas.microsoft.com/office/word/2010/wordprocessingShape" mc:Ignorable="w14 w15 w16se wp14">
   <w:body>
     <w:p>
+      <w:pPr>
+        <w:rPr>
+          <w:sz w:val="20"/>
+          <w:szCs w:val="20"/>
+        </w:rPr>
+      </w:pPr>
       <w:r>
+        <w:rPr>
+          <w:sz w:val="24"/>
+        </w:rPr>
         <w:t>外文編譯中心QCD</w:t>
       </w:r>
     </w:p>
     <w:p>
+      <w:pPr>
+        <w:rPr>
+          <w:sz w:val="20"/>
+          <w:szCs w:val="20"/>
+        </w:rPr>
+      </w:pPr>
       <w:r>
+        <w:rPr>
+          <w:sz w:val="24"/>
+        </w:rPr>
         <w:t>姓名: {{NAME}}</w:t>
       </w:r>
     </w:p>
     <w:p>
+      <w:pPr>
+        <w:rPr>
+          <w:sz w:val="20"/>
+          <w:szCs w:val="20"/>
+        </w:rPr>
+      </w:pPr>
       <w:r>
+        <w:rPr>
+          <w:sz w:val="24"/>
+        </w:rPr>
         <w:t>{{MONTH}}</w:t>
       </w:r>
     </w:p>
     <w:p>
+      <w:pPr>
+        <w:rPr>
+          <w:sz w:val="20"/>
+          <w:szCs w:val="20"/>
+        </w:rPr>
+      </w:pPr>
       <w:r>
+        <w:rPr>
+          <w:sz w:val="24"/>
+        </w:rPr>
         <w:t>本月精進目標:</w:t>
       </w:r>
     </w:p>
+    <w:p>
+      <w:pPr>
+        <w:rPr>
+          <w:sz w:val="20"/>
+          <w:szCs w:val="20"/>
+        </w:rPr>
+      </w:pPr>
+    </w:p>
+    <w:p>
+      <w:pPr>
+        <w:rPr>
+          <w:sz w:val="20"/>
+          <w:szCs w:val="20"/>
+        </w:rPr>
+      </w:pPr>
+    </w:p>
+    <w:tbl>
+      <w:tblPr>
+        <w:tblStyle w:val="a3"/>
+        <w:tblW w:w="8217" w:type="dxa"/>
+        <w:tblLook w:val="04A0" w:firstRow="1" w:lastRow="0" w:firstColumn="1" w:lastColumn="0" w:noHBand="0" w:noVBand="1"/>
+      </w:tblPr>
+      <w:tblGrid>
+        <w:gridCol w:w="804"/>
+        <w:gridCol w:w="1979"/>
+        <w:gridCol w:w="3024"/>
+        <w:gridCol w:w="2410"/>
+      </w:tblGrid>
+      <w:tr>
+        <w:tc>
+          <w:tcPr>
+            <w:tcW w:w="804" w:type="dxa"/>
+          </w:tcPr>
+          <w:p>
+            <w:pPr>
+              <w:jc w:val="center"/>
+              <w:rPr>
+                <w:b/>
+                <w:color w:val="00B050"/>
+                <w:sz w:val="20"/>
+                <w:szCs w:val="20"/>
+              </w:rPr>
+            </w:pPr>
+            <w:r>
+              <w:rPr>
+                <w:rFonts w:hint="eastAsia"/>
+                <w:b/>
+                <w:color w:val="00B050"/>
+                <w:sz w:val="20"/>
+                <w:szCs w:val="20"/>
+              </w:rPr>
+              <w:t>日期</w:t>
+            </w:r>
+          </w:p>
+        </w:tc>
+        <w:tc>
+          <w:tcPr>
+            <w:tcW w:w="1979" w:type="dxa"/>
+          </w:tcPr>
+          <w:p>
+            <w:pPr>
+              <w:jc w:val="center"/>
+              <w:rPr>
+                <w:b/>
+                <w:color w:val="00B050"/>
+                <w:sz w:val="20"/>
+                <w:szCs w:val="20"/>
+              </w:rPr>
+            </w:pPr>
+            <w:r>
+              <w:rPr>
+                <w:rFonts w:hint="eastAsia"/>
+                <w:b/>
+                <w:color w:val="00B050"/>
+                <w:sz w:val="20"/>
+                <w:szCs w:val="20"/>
+              </w:rPr>
+              <w:t>(</w:t>
+            </w:r>
+            <w:r>
+              <w:rPr>
+                <w:rFonts w:hint="eastAsia"/>
+                <w:b/>
+                <w:color w:val="00B050"/>
+                <w:sz w:val="20"/>
+                <w:szCs w:val="20"/>
+              </w:rPr>
+              <w:t>例行</w:t>
+            </w:r>
+            <w:r>
+              <w:rPr>
+                <w:rFonts w:hint="eastAsia"/>
+                <w:b/>
+                <w:color w:val="00B050"/>
+                <w:sz w:val="20"/>
+                <w:szCs w:val="20"/>
+              </w:rPr>
+              <w:t>)</w:t>
+            </w:r>
+            <w:r>
+              <w:rPr>
+                <w:rFonts w:hint="eastAsia"/>
+                <w:b/>
+                <w:color w:val="00B050"/>
+                <w:sz w:val="20"/>
+                <w:szCs w:val="20"/>
+              </w:rPr>
+              <w:t>字幕翻譯</w:t>
+            </w:r>
+          </w:p>
+        </w:tc>
+        <w:tc>
+          <w:tcPr>
+            <w:tcW w:w="3024" w:type="dxa"/>
+          </w:tcPr>
+          <w:p>
+            <w:pPr>
+              <w:jc w:val="center"/>
+              <w:rPr>
+                <w:b/>
+                <w:color w:val="00B050"/>
+                <w:sz w:val="20"/>
+                <w:szCs w:val="20"/>
+              </w:rPr>
+            </w:pPr>
+            <w:r>
+              <w:rPr>
+                <w:rFonts w:hint="eastAsia"/>
+                <w:b/>
+                <w:color w:val="00B050"/>
+                <w:sz w:val="20"/>
+                <w:szCs w:val="20"/>
+              </w:rPr>
+              <w:t>編輯回饋</w:t>
+            </w:r>
+          </w:p>
+        </w:tc>
+        <w:tc>
+          <w:tcPr>
+            <w:tcW w:w="2410" w:type="dxa"/>
+          </w:tcPr>
+          <w:p>
+            <w:pPr>
+              <w:jc w:val="center"/>
+              <w:rPr>
+                <w:b/>
+                <w:color w:val="00B050"/>
+                <w:sz w:val="20"/>
+                <w:szCs w:val="20"/>
+              </w:rPr>
+            </w:pPr>
+            <w:r>
+              <w:rPr>
+                <w:rFonts w:hint="eastAsia"/>
+                <w:b/>
+                <w:color w:val="00B050"/>
+                <w:sz w:val="20"/>
+                <w:szCs w:val="20"/>
+              </w:rPr>
+              <w:t>主管回饋</w:t>
+            </w:r>
+          </w:p>
+        </w:tc>
+      </w:tr>
+      <w:tr>
+        <w:tc>
+          <w:tcPr>
+            <w:tcW w:w="804" w:type="dxa"/>
+          </w:tcPr>
+          <w:p>
+            <w:r>
+              <w:rPr>
+                <w:sz w:val="20"/>
+              </w:rPr>
+            </w:r>
+          </w:p>
+        </w:tc>
+        <w:tc>
+          <w:tcPr>
+            <w:tcW w:w="1979" w:type="dxa"/>
+          </w:tcPr>
+          <w:p>
+            <w:r>
+              <w:rPr>
+                <w:sz w:val="20"/>
+              </w:rPr>
+            </w:r>
+          </w:p>
+        </w:tc>
+        <w:tc>
+          <w:tcPr>
+            <w:tcW w:w="3024" w:type="dxa"/>
+          </w:tcPr>
+          <w:p>
+            <w:r>
+              <w:rPr>
+                <w:sz w:val="20"/>
+              </w:rPr>
+            </w:r>
+          </w:p>
+        </w:tc>
+        <w:tc>
+          <w:tcPr>
+            <w:tcW w:w="2410" w:type="dxa"/>
+          </w:tcPr>
+          <w:p>
+            <w:r>
+              <w:rPr>
+                <w:sz w:val="20"/>
+              </w:rPr>
+            </w:r>
+          </w:p>
+        </w:tc>
+      </w:tr>
+      <w:tr>
+        <w:tc>
+          <w:tcPr>
+            <w:tcW w:w="804" w:type="dxa"/>
+          </w:tcPr>
+          <w:p>
+            <w:r>
+              <w:rPr>
+                <w:sz w:val="20"/>
+              </w:rPr>
+            </w:r>
+          </w:p>
+        </w:tc>
+        <w:tc>
+          <w:tcPr>
+            <w:tcW w:w="1979" w:type="dxa"/>
+          </w:tcPr>
+          <w:p>
+            <w:r>
+              <w:rPr>
+                <w:sz w:val="20"/>
+              </w:rPr>
+            </w:r>
+          </w:p>
+        </w:tc>
+        <w:tc>
+          <w:tcPr>
+            <w:tcW w:w="3024" w:type="dxa"/>
+          </w:tcPr>
+          <w:p>
+            <w:r>
+              <w:rPr>
+                <w:sz w:val="20"/>
+              </w:rPr>
+            </w:r>
+          </w:p>
+        </w:tc>
+        <w:tc>
+          <w:tcPr>
+            <w:tcW w:w="2410" w:type="dxa"/>
+          </w:tcPr>
+          <w:p>
+            <w:r>
+              <w:rPr>
+                <w:sz w:val="20"/>
+              </w:rPr>
+            </w:r>
+          </w:p>
+        </w:tc>
+      </w:tr>
+      <w:tr>
+        <w:tc>
+          <w:tcPr>
+            <w:tcW w:w="804" w:type="dxa"/>
+          </w:tcPr>
+          <w:p>
+            <w:r>
+              <w:rPr>
+                <w:sz w:val="20"/>
+              </w:rPr>
+            </w:r>
+          </w:p>
+        </w:tc>
+        <w:tc>
+          <w:tcPr>
+            <w:tcW w:w="1979" w:type="dxa"/>
+          </w:tcPr>
+          <w:p>
+            <w:r>
+              <w:rPr>
+                <w:sz w:val="20"/>
+              </w:rPr>
+            </w:r>
+          </w:p>
+        </w:tc>
+        <w:tc>
+          <w:tcPr>
+            <w:tcW w:w="3024" w:type="dxa"/>
+          </w:tcPr>
+          <w:p>
+            <w:r>
+              <w:rPr>
+                <w:sz w:val="20"/>
+              </w:rPr>
+            </w:r>
+          </w:p>
+        </w:tc>
+        <w:tc>
+          <w:tcPr>
+            <w:tcW w:w="2410" w:type="dxa"/>
+          </w:tcPr>
+          <w:p>
+            <w:r>
+              <w:rPr>
+                <w:sz w:val="20"/>
+              </w:rPr>
+            </w:r>
+          </w:p>
+        </w:tc>
+      </w:tr>
+      <w:tr>
+        <w:tc>
+          <w:tcPr>
+            <w:tcW w:w="804" w:type="dxa"/>
+          </w:tcPr>
+          <w:p>
+            <w:r>
+              <w:rPr>
+                <w:sz w:val="20"/>
+              </w:rPr>
+            </w:r>
+          </w:p>
+        </w:tc>
+        <w:tc>
+          <w:tcPr>
+            <w:tcW w:w="1979" w:type="dxa"/>
+          </w:tcPr>
+          <w:p>
+            <w:r>
+              <w:rPr>
+                <w:sz w:val="20"/>
+              </w:rPr>
+            </w:r>
+          </w:p>
+        </w:tc>
+        <w:tc>
+          <w:tcPr>
+            <w:tcW w:w="3024" w:type="dxa"/>
+          </w:tcPr>
+          <w:p>
+            <w:r>
+              <w:rPr>
+                <w:sz w:val="20"/>
+              </w:rPr>
+            </w:r>
+          </w:p>
+        </w:tc>
+        <w:tc>
+          <w:tcPr>
+            <w:tcW w:w="2410" w:type="dxa"/>
+          </w:tcPr>
+          <w:p>
+            <w:r>
+              <w:rPr>
+                <w:sz w:val="20"/>
+              </w:rPr>
+            </w:r>
+          </w:p>
+        </w:tc>
+      </w:tr>
+      <w:tr>
+        <w:tc>
+          <w:tcPr>
+            <w:tcW w:w="804" w:type="dxa"/>
+          </w:tcPr>
+          <w:p>
+            <w:pPr>
+              <w:rPr>
+                <w:rFonts w:hint="eastAsia"/>
+                <w:sz w:val="20"/>
+                <w:szCs w:val="20"/>
+              </w:rPr>
+            </w:pPr>
+            <w:r>
+              <w:rPr>
+                <w:rFonts w:hint="eastAsia"/>
+                <w:b/>
+                <w:color w:val="00B050"/>
+                <w:sz w:val="20"/>
+                <w:szCs w:val="20"/>
+              </w:rPr>
+              <w:t>日期</w:t>
+            </w:r>
+          </w:p>
+        </w:tc>
+        <w:tc>
+          <w:tcPr>
+            <w:tcW w:w="1979" w:type="dxa"/>
+          </w:tcPr>
+          <w:p>
+            <w:pPr>
+              <w:rPr>
+                <w:rFonts w:hint="eastAsia"/>
+                <w:sz w:val="20"/>
+                <w:szCs w:val="20"/>
+              </w:rPr>
+            </w:pPr>
+            <w:r>
+              <w:rPr>
+                <w:rFonts w:hint="eastAsia"/>
+                <w:b/>
+                <w:color w:val="00B050"/>
+                <w:sz w:val="20"/>
+                <w:szCs w:val="20"/>
+              </w:rPr>
+              <w:t>(</w:t>
+            </w:r>
+            <w:r>
+              <w:rPr>
+                <w:rFonts w:hint="eastAsia"/>
+                <w:b/>
+                <w:color w:val="00B050"/>
+                <w:sz w:val="20"/>
+                <w:szCs w:val="20"/>
+              </w:rPr>
+              <w:t>例行</w:t>
+            </w:r>
+            <w:r>
+              <w:rPr>
+                <w:rFonts w:hint="eastAsia"/>
+                <w:b/>
+                <w:color w:val="00B050"/>
+                <w:sz w:val="20"/>
+                <w:szCs w:val="20"/>
+              </w:rPr>
+              <w:t>)</w:t>
+            </w:r>
+            <w:r>
+              <w:rPr>
+                <w:rFonts w:hint="eastAsia"/>
+                <w:b/>
+                <w:color w:val="00B050"/>
+                <w:sz w:val="20"/>
+                <w:szCs w:val="20"/>
+              </w:rPr>
+              <w:t>字幕審稿</w:t>
+            </w:r>
+          </w:p>
+        </w:tc>
+        <w:tc>
+          <w:tcPr>
+            <w:tcW w:w="3024" w:type="dxa"/>
+          </w:tcPr>
+          <w:p>
+            <w:pPr>
+              <w:rPr>
+                <w:sz w:val="20"/>
+                <w:szCs w:val="20"/>
+              </w:rPr>
+            </w:pPr>
+          </w:p>
+        </w:tc>
+        <w:tc>
+          <w:tcPr>
+            <w:tcW w:w="2410" w:type="dxa"/>
+          </w:tcPr>
+          <w:p>
+            <w:pPr>
+              <w:rPr>
+                <w:sz w:val="20"/>
+                <w:szCs w:val="20"/>
+              </w:rPr>
+            </w:pPr>
+          </w:p>
+        </w:tc>
+      </w:tr>
+      <w:tr>
+        <w:tc>
+          <w:tcPr>
+            <w:tcW w:w="804" w:type="dxa"/>
+          </w:tcPr>
+          <w:p>
+            <w:r>
+              <w:rPr>
+                <w:sz w:val="20"/>
+              </w:rPr>
+            </w:r>
+          </w:p>
+        </w:tc>
+        <w:tc>
+          <w:tcPr>
+            <w:tcW w:w="1979" w:type="dxa"/>
+          </w:tcPr>
+          <w:p>
+            <w:r>
+              <w:rPr>
+                <w:sz w:val="20"/>
+              </w:rPr>
+            </w:r>
+          </w:p>
+        </w:tc>
+        <w:tc>
+          <w:tcPr>
+            <w:tcW w:w="3024" w:type="dxa"/>
+          </w:tcPr>
+          <w:p>
+            <w:r>
+              <w:rPr>
+                <w:sz w:val="20"/>
+              </w:rPr>
+            </w:r>
+          </w:p>
+        </w:tc>
+        <w:tc>
+          <w:tcPr>
+            <w:tcW w:w="2410" w:type="dxa"/>
+          </w:tcPr>
+          <w:p>
+            <w:r>
+              <w:rPr>
+                <w:sz w:val="20"/>
+              </w:rPr>
+            </w:r>
+          </w:p>
+        </w:tc>
+      </w:tr>
+      <w:tr>
+        <w:tc>
+          <w:tcPr>
+            <w:tcW w:w="804" w:type="dxa"/>
+          </w:tcPr>
+          <w:p>
+            <w:r>
+              <w:rPr>
+                <w:sz w:val="20"/>
+              </w:rPr>
+            </w:r>
+          </w:p>
+        </w:tc>
+        <w:tc>
+          <w:tcPr>
+            <w:tcW w:w="1979" w:type="dxa"/>
+          </w:tcPr>
+          <w:p>
+            <w:r>
+              <w:rPr>
+                <w:sz w:val="20"/>
+              </w:rPr>
+            </w:r>
+          </w:p>
+        </w:tc>
+        <w:tc>
+          <w:tcPr>
+            <w:tcW w:w="3024" w:type="dxa"/>
+          </w:tcPr>
+          <w:p>
+            <w:r>
+              <w:rPr>
+                <w:sz w:val="20"/>
+              </w:rPr>
+            </w:r>
+          </w:p>
+        </w:tc>
+        <w:tc>
+          <w:tcPr>
+            <w:tcW w:w="2410" w:type="dxa"/>
+          </w:tcPr>
+          <w:p>
+            <w:r>
+              <w:rPr>
+                <w:sz w:val="20"/>
+              </w:rPr>
+            </w:r>
+          </w:p>
+        </w:tc>
+      </w:tr>
+      <w:tr>
+        <w:tc>
+          <w:tcPr>
+            <w:tcW w:w="804" w:type="dxa"/>
+          </w:tcPr>
+          <w:p>
+            <w:r>
+              <w:rPr>
+                <w:sz w:val="20"/>
+              </w:rPr>
+            </w:r>
+          </w:p>
+        </w:tc>
+        <w:tc>
+          <w:tcPr>
+            <w:tcW w:w="1979" w:type="dxa"/>
+          </w:tcPr>
+          <w:p>
+            <w:r>
+              <w:rPr>
+                <w:sz w:val="20"/>
+              </w:rPr>
+            </w:r>
+          </w:p>
+        </w:tc>
+        <w:tc>
+          <w:tcPr>
+            <w:tcW w:w="3024" w:type="dxa"/>
+          </w:tcPr>
+          <w:p>
+            <w:r>
+              <w:rPr>
+                <w:sz w:val="20"/>
+              </w:rPr>
+            </w:r>
+          </w:p>
+        </w:tc>
+        <w:tc>
+          <w:tcPr>
+            <w:tcW w:w="2410" w:type="dxa"/>
+          </w:tcPr>
+          <w:p>
+            <w:r>
+              <w:rPr>
+                <w:sz w:val="20"/>
+              </w:rPr>
+            </w:r>
+          </w:p>
+        </w:tc>
+      </w:tr>
+      <w:tr>
+        <w:tc>
+          <w:tcPr>
+            <w:tcW w:w="804" w:type="dxa"/>
+          </w:tcPr>
+          <w:p>
+            <w:pPr>
+              <w:rPr>
+                <w:rFonts w:hint="eastAsia"/>
+                <w:b/>
+                <w:color w:val="FF0000"/>
+                <w:sz w:val="20"/>
+                <w:szCs w:val="20"/>
+              </w:rPr>
+            </w:pPr>
+            <w:r>
+              <w:rPr>
+                <w:rFonts w:hint="eastAsia"/>
+                <w:b/>
+                <w:color w:val="FF0000"/>
+                <w:sz w:val="20"/>
+                <w:szCs w:val="20"/>
+              </w:rPr>
+              <w:t>日期</w:t>
+            </w:r>
+          </w:p>
+        </w:tc>
+        <w:tc>
+          <w:tcPr>
+            <w:tcW w:w="1979" w:type="dxa"/>
+          </w:tcPr>
+          <w:p>
+            <w:pPr>
+              <w:rPr>
+                <w:rFonts w:hint="eastAsia"/>
+                <w:b/>
+                <w:color w:val="FF0000"/>
+                <w:sz w:val="20"/>
+                <w:szCs w:val="20"/>
+              </w:rPr>
+            </w:pPr>
+            <w:r>
+              <w:rPr>
+                <w:rFonts w:hint="eastAsia"/>
+                <w:b/>
+                <w:color w:val="FF0000"/>
+                <w:sz w:val="20"/>
+                <w:szCs w:val="20"/>
+              </w:rPr>
+              <w:t>臨時工作</w:t>
+            </w:r>
+          </w:p>
+        </w:tc>
+        <w:tc>
+          <w:tcPr>
+            <w:tcW w:w="3024" w:type="dxa"/>
+          </w:tcPr>
+          <w:p>
+            <w:pPr>
+              <w:rPr>
+                <w:sz w:val="20"/>
+                <w:szCs w:val="20"/>
+              </w:rPr>
+            </w:pPr>
+          </w:p>
+        </w:tc>
+        <w:tc>
+          <w:tcPr>
+            <w:tcW w:w="2410" w:type="dxa"/>
+          </w:tcPr>
+          <w:p>
+            <w:pPr>
+              <w:rPr>
+                <w:sz w:val="20"/>
+                <w:szCs w:val="20"/>
+              </w:rPr>
+            </w:pPr>
+          </w:p>
+        </w:tc>
+      </w:tr>
+      <w:tr>
+        <w:tc>
+          <w:tcPr>
+            <w:tcW w:w="804" w:type="dxa"/>
+          </w:tcPr>
+          <w:p>
+            <w:r>
+              <w:rPr>
+                <w:sz w:val="20"/>
+              </w:rPr>
+            </w:r>
+          </w:p>
+        </w:tc>
+        <w:tc>
+          <w:tcPr>
+            <w:tcW w:w="1979" w:type="dxa"/>
+          </w:tcPr>
+          <w:p>
+            <w:r>
+              <w:rPr>
+                <w:sz w:val="20"/>
+              </w:rPr>
+            </w:r>
+          </w:p>
+        </w:tc>
+        <w:tc>
+          <w:tcPr>
+            <w:tcW w:w="3024" w:type="dxa"/>
+          </w:tcPr>
+          <w:p>
+            <w:r>
+              <w:rPr>
+                <w:sz w:val="20"/>
+              </w:rPr>
+            </w:r>
+          </w:p>
+        </w:tc>
+        <w:tc>
+          <w:tcPr>
+            <w:tcW w:w="2410" w:type="dxa"/>
+          </w:tcPr>
+          <w:p>
+            <w:r>
+              <w:rPr>
+                <w:sz w:val="20"/>
+              </w:rPr>
+            </w:r>
+          </w:p>
+        </w:tc>
+      </w:tr>
+      <w:tr>
+        <w:tc>
+          <w:tcPr>
+            <w:tcW w:w="804" w:type="dxa"/>
+          </w:tcPr>
+          <w:p>
+            <w:r>
+              <w:rPr>
+                <w:sz w:val="20"/>
+              </w:rPr>
+            </w:r>
+          </w:p>
+        </w:tc>
+        <w:tc>
+          <w:tcPr>
+            <w:tcW w:w="1979" w:type="dxa"/>
+          </w:tcPr>
+          <w:p>
+            <w:r>
+              <w:rPr>
+                <w:sz w:val="20"/>
+              </w:rPr>
+            </w:r>
+          </w:p>
+        </w:tc>
+        <w:tc>
+          <w:tcPr>
+            <w:tcW w:w="3024" w:type="dxa"/>
+          </w:tcPr>
+          <w:p>
+            <w:r>
+              <w:rPr>
+                <w:sz w:val="20"/>
+              </w:rPr>
+            </w:r>
+          </w:p>
+        </w:tc>
+        <w:tc>
+          <w:tcPr>
+            <w:tcW w:w="2410" w:type="dxa"/>
+          </w:tcPr>
+          <w:p>
+            <w:r>
+              <w:rPr>
+                <w:sz w:val="20"/>
+              </w:rPr>
+            </w:r>
+          </w:p>
+        </w:tc>
+      </w:tr>
+      <w:tr>
+        <w:tc>
+          <w:tcPr>
+            <w:tcW w:w="8217" w:type="dxa"/>
+            <w:gridSpan w:val="4"/>
+          </w:tcPr>
+          <w:p>
+            <w:r>
+              <w:rPr>
+                <w:sz w:val="20"/>
+              </w:rPr>
+              <w:t>本月工作心得:</w:t>
+            </w:r>
+          </w:p>
+          <w:p/>
+          <w:p/>
+          <w:p>
+            <w:r>
+              <w:rPr>
+                <w:sz w:val="20"/>
+              </w:rPr>
+              <w:t>工作亮點:</w:t>
+            </w:r>
+          </w:p>
+          <w:p>
+            <w:r>
+              <w:rPr>
+                <w:sz w:val="20"/>
+              </w:rPr>
+              <w:t>健忘次數與事項:</w:t>
+            </w:r>
+          </w:p>
+          <w:p>
+            <w:r>
+              <w:rPr>
+                <w:sz w:val="20"/>
+              </w:rPr>
+              <w:t>特休假:</w:t>
+            </w:r>
+          </w:p>
+          <w:p>
+            <w:r>
+              <w:rPr>
+                <w:sz w:val="20"/>
+              </w:rPr>
+              <w:t>同心圓會議:</w:t>
+            </w:r>
+          </w:p>
+          <w:p>
+            <w:r>
+              <w:rPr>
+                <w:sz w:val="20"/>
+              </w:rPr>
+              <w:t>部門內部會議:</w:t>
+            </w:r>
+          </w:p>
+        </w:tc>
+      </w:tr>
+      <w:tr>
+        <w:tc>
+          <w:tcPr>
+            <w:tcW w:w="8217" w:type="dxa"/>
+            <w:gridSpan w:val="4"/>
+          </w:tcPr>
+          <w:p>
+            <w:r>
+              <w:rPr>
+                <w:sz w:val="20"/>
+              </w:rPr>
+              <w:t>本月總翻譯時數(字幕): (影片長度總和 非工作時數)</w:t>
+            </w:r>
+          </w:p>
+          <w:p>
+            <w:r>
+              <w:rPr>
+                <w:sz w:val="20"/>
+              </w:rPr>
+              <w:t>中翻英:</w:t>
+            </w:r>
+          </w:p>
+          <w:p>
+            <w:r>
+              <w:rPr>
+                <w:sz w:val="20"/>
+              </w:rPr>
+              <w:t>英翻中:</w:t>
+            </w:r>
+          </w:p>
+          <w:p/>
+          <w:p>
+            <w:r>
+              <w:rPr>
+                <w:sz w:val="20"/>
+              </w:rPr>
+              <w:t>本月總審稿時數(字幕): (影片長度總和 非工作時數)</w:t>
+            </w:r>
+          </w:p>
+          <w:p>
+            <w:r>
+              <w:rPr>
+                <w:sz w:val="20"/>
+              </w:rPr>
+              <w:t>中翻英:</w:t>
+            </w:r>
+          </w:p>
+          <w:p>
+            <w:r>
+              <w:rPr>
+                <w:sz w:val="20"/>
+              </w:rPr>
+              <w:t>英翻中:</w:t>
+            </w:r>
+          </w:p>
+          <w:p/>
+          <w:p>
+            <w:r>
+              <w:rPr>
+                <w:sz w:val="20"/>
+              </w:rPr>
+              <w:t>其他工作:</w:t>
+            </w:r>
+          </w:p>
+          <w:p>
+            <w:r>
+              <w:rPr>
+                <w:sz w:val="20"/>
+              </w:rPr>
+              <w:t>定稿標題簡介縮圖:</w:t>
+            </w:r>
+          </w:p>
+          <w:p>
+            <w:r>
+              <w:rPr>
+                <w:sz w:val="20"/>
+              </w:rPr>
+              <w:t>寫IG:</w:t>
+            </w:r>
+          </w:p>
+          <w:p>
+            <w:r>
+              <w:rPr>
+                <w:sz w:val="20"/>
+              </w:rPr>
+              <w:t>LW edit:</w:t>
+            </w:r>
+          </w:p>
+          <w:p>
+            <w:r>
+              <w:rPr>
+                <w:sz w:val="20"/>
+              </w:rPr>
+              <w:t>小編文:</w:t>
+            </w:r>
+          </w:p>
+          <w:p>
+            <w:r>
+              <w:rPr>
+                <w:sz w:val="20"/>
+              </w:rPr>
+              <w:t>節目上網:</w:t>
+            </w:r>
+          </w:p>
+          <w:p>
+            <w:r>
+              <w:rPr>
+                <w:sz w:val="20"/>
+              </w:rPr>
+              <w:t>製作QA/Quote:</w:t>
+            </w:r>
+          </w:p>
+          <w:p>
+            <w:r>
+              <w:rPr>
+                <w:sz w:val="20"/>
+              </w:rPr>
+              <w:t>節錄經典:</w:t>
+            </w:r>
+          </w:p>
+          <w:p/>
+          <w:p>
+            <w:r>
+              <w:rPr>
+                <w:sz w:val="20"/>
+              </w:rPr>
+              <w:t>行政工作:</w:t>
+            </w:r>
+          </w:p>
+          <w:p>
+            <w:r>
+              <w:rPr>
+                <w:sz w:val="20"/>
+              </w:rPr>
+              <w:t>PM選稿子:</w:t>
+            </w:r>
+          </w:p>
+        </w:tc>
+      </w:tr>
+      <w:tr>
+        <w:tc>
+          <w:tcPr>
+            <w:tcW w:w="8217" w:type="dxa"/>
+            <w:gridSpan w:val="4"/>
+          </w:tcPr>
+          <w:p>
+            <w:r>
+              <w:rPr>
+                <w:sz w:val="20"/>
+              </w:rPr>
+              <w:t>之前工作紀錄</w:t>
+            </w:r>
+          </w:p>
+        </w:tc>
+      </w:tr>
+      <w:tr>
+        <w:tc>
+          <w:tcPr>
+            <w:tcW w:w="804" w:type="dxa"/>
+          </w:tcPr>
+          <w:p>
+            <w:pPr>
+              <w:jc w:val="center"/>
+              <w:rPr>
+                <w:b/>
+                <w:color w:val="00B050"/>
+                <w:sz w:val="20"/>
+                <w:szCs w:val="20"/>
+              </w:rPr>
+            </w:pPr>
+            <w:r>
+              <w:rPr>
+                <w:rFonts w:hint="eastAsia"/>
+                <w:b/>
+                <w:color w:val="00B050"/>
+                <w:sz w:val="20"/>
+                <w:szCs w:val="20"/>
+              </w:rPr>
+              <w:t>日期</w:t>
+            </w:r>
+          </w:p>
+        </w:tc>
+        <w:tc>
+          <w:tcPr>
+            <w:tcW w:w="1979" w:type="dxa"/>
+          </w:tcPr>
+          <w:p>
+            <w:pPr>
+              <w:jc w:val="center"/>
+              <w:rPr>
+                <w:b/>
+                <w:color w:val="00B050"/>
+                <w:sz w:val="20"/>
+                <w:szCs w:val="20"/>
+              </w:rPr>
+            </w:pPr>
+            <w:r>
+              <w:rPr>
+                <w:rFonts w:hint="eastAsia"/>
+                <w:b/>
+                <w:color w:val="00B050"/>
+                <w:sz w:val="20"/>
+                <w:szCs w:val="20"/>
+              </w:rPr>
+              <w:t>工作項目</w:t>
+            </w:r>
+          </w:p>
+        </w:tc>
+        <w:tc>
+          <w:tcPr>
+            <w:tcW w:w="3024" w:type="dxa"/>
+          </w:tcPr>
+          <w:p>
+            <w:pPr>
+              <w:jc w:val="center"/>
+              <w:rPr>
+                <w:b/>
+                <w:color w:val="00B050"/>
+                <w:sz w:val="20"/>
+                <w:szCs w:val="20"/>
+              </w:rPr>
+            </w:pPr>
+            <w:r>
+              <w:rPr>
+                <w:rFonts w:hint="eastAsia"/>
+                <w:b/>
+                <w:color w:val="00B050"/>
+                <w:sz w:val="20"/>
+                <w:szCs w:val="20"/>
+              </w:rPr>
+              <w:t>編輯回饋</w:t>
+            </w:r>
+          </w:p>
+        </w:tc>
+        <w:tc>
+          <w:tcPr>
+            <w:tcW w:w="2410" w:type="dxa"/>
+          </w:tcPr>
+          <w:p>
+            <w:pPr>
+              <w:jc w:val="center"/>
+              <w:rPr>
+                <w:b/>
+                <w:color w:val="00B050"/>
+                <w:sz w:val="20"/>
+                <w:szCs w:val="20"/>
+              </w:rPr>
+            </w:pPr>
+            <w:r>
+              <w:rPr>
+                <w:rFonts w:hint="eastAsia"/>
+                <w:b/>
+                <w:color w:val="00B050"/>
+                <w:sz w:val="20"/>
+                <w:szCs w:val="20"/>
+              </w:rPr>
+              <w:t>主管回饋</w:t>
+            </w:r>
+          </w:p>
+        </w:tc>
+      </w:tr>
+      <w:tr>
+        <w:tc>
+          <w:tcPr>
+            <w:tcW w:w="804" w:type="dxa"/>
+          </w:tcPr>
+          <w:p>
+            <w:r>
+              <w:rPr>
+                <w:sz w:val="20"/>
+              </w:rPr>
+            </w:r>
+          </w:p>
+        </w:tc>
+        <w:tc>
+          <w:tcPr>
+            <w:tcW w:w="1979" w:type="dxa"/>
+          </w:tcPr>
+          <w:p>
+            <w:r>
+              <w:rPr>
+                <w:sz w:val="20"/>
+              </w:rPr>
+            </w:r>
+          </w:p>
+        </w:tc>
+        <w:tc>
+          <w:tcPr>
+            <w:tcW w:w="3024" w:type="dxa"/>
+          </w:tcPr>
+          <w:p>
+            <w:r>
+              <w:rPr>
+                <w:sz w:val="20"/>
+              </w:rPr>
+            </w:r>
+          </w:p>
+        </w:tc>
+        <w:tc>
+          <w:tcPr>
+            <w:tcW w:w="2410" w:type="dxa"/>
+          </w:tcPr>
+          <w:p>
+            <w:r>
+              <w:rPr>
+                <w:sz w:val="20"/>
+              </w:rPr>
+            </w:r>
+          </w:p>
+        </w:tc>
+      </w:tr>
+      <w:tr>
+        <w:tc>
+          <w:tcPr>
+            <w:tcW w:w="804" w:type="dxa"/>
+          </w:tcPr>
+          <w:p>
+            <w:r>
+              <w:rPr>
+                <w:sz w:val="20"/>
+              </w:rPr>
+            </w:r>
+          </w:p>
+        </w:tc>
+        <w:tc>
+          <w:tcPr>
+            <w:tcW w:w="1979" w:type="dxa"/>
+          </w:tcPr>
+          <w:p>
+            <w:r>
+              <w:rPr>
+                <w:sz w:val="20"/>
+              </w:rPr>
+            </w:r>
+          </w:p>
+        </w:tc>
+        <w:tc>
+          <w:tcPr>
+            <w:tcW w:w="3024" w:type="dxa"/>
+          </w:tcPr>
+          <w:p>
+            <w:r>
+              <w:rPr>
+                <w:sz w:val="20"/>
+              </w:rPr>
+            </w:r>
+          </w:p>
+        </w:tc>
+        <w:tc>
+          <w:tcPr>
+            <w:tcW w:w="2410" w:type="dxa"/>
+          </w:tcPr>
+          <w:p>
+            <w:r>
+              <w:rPr>
+                <w:sz w:val="20"/>
+              </w:rPr>
+            </w:r>
+          </w:p>
+        </w:tc>
+      </w:tr>
+      <w:tr>
+        <w:tc>
+          <w:tcPr>
+            <w:tcW w:w="804" w:type="dxa"/>
+          </w:tcPr>
+          <w:p>
+            <w:r>
+              <w:rPr>
+                <w:sz w:val="20"/>
+              </w:rPr>
+            </w:r>
+          </w:p>
+        </w:tc>
+        <w:tc>
+          <w:tcPr>
+            <w:tcW w:w="1979" w:type="dxa"/>
+          </w:tcPr>
+          <w:p>
+            <w:r>
+              <w:rPr>
+                <w:sz w:val="20"/>
+              </w:rPr>
+            </w:r>
+          </w:p>
+        </w:tc>
+        <w:tc>
+          <w:tcPr>
+            <w:tcW w:w="3024" w:type="dxa"/>
+          </w:tcPr>
+          <w:p>
+            <w:r>
+              <w:rPr>
+                <w:sz w:val="20"/>
+              </w:rPr>
+            </w:r>
+          </w:p>
+        </w:tc>
+        <w:tc>
+          <w:tcPr>
+            <w:tcW w:w="2410" w:type="dxa"/>
+          </w:tcPr>
+          <w:p>
+            <w:r>
+              <w:rPr>
+                <w:sz w:val="20"/>
+              </w:rPr>
+            </w:r>
+          </w:p>
+        </w:tc>
+      </w:tr>
+    </w:tbl>
+    <w:p>
+      <w:pPr>
+        <w:rPr>
+          <w:sz w:val="20"/>
+          <w:szCs w:val="20"/>
+        </w:rPr>
+      </w:pPr>
+    </w:p>
     <w:sectPr>
       <w:pgSz w:w="11906" w:h="16838"/>
-      <w:pgMar w:top="1440" w:right="1153" w:bottom="1440" w:left="1153" w:header="851" w:footer="992" w:gutter="0"/>
+      <w:pgMar w:top="1440" w:right="1800" w:bottom="1440" w:left="1800" w:header="851" w:footer="992" w:gutter="0"/>
       <w:cols w:space="425"/>
       <w:docGrid w:type="lines" w:linePitch="360"/>
     </w:sectPr>
@@ -68,6 +1382,195 @@
     </w:p>
   </w:footnote>
 </w:footnotes>
+</file>
+
+<file path=word/numbering.xml><?xml version="1.0" encoding="utf-8"?>
+<w:numbering xmlns:wpc="http://schemas.microsoft.com/office/word/2010/wordprocessingCanvas" xmlns:cx="http://schemas.microsoft.com/office/drawing/2014/chartex" xmlns:mc="http://schemas.openxmlformats.org/markup-compatibility/2006" xmlns:o="urn:schemas-microsoft-com:office:office" xmlns:r="http://schemas.openxmlformats.org/officeDocument/2006/relationships" xmlns:m="http://schemas.openxmlformats.org/officeDocument/2006/math" xmlns:v="urn:schemas-microsoft-com:vml" xmlns:wp14="http://schemas.microsoft.com/office/word/2010/wordprocessingDrawing" xmlns:wp="http://schemas.openxmlformats.org/drawingml/2006/wordprocessingDrawing" xmlns:w10="urn:schemas-microsoft-com:office:word" xmlns:w="http://schemas.openxmlformats.org/wordprocessingml/2006/main" xmlns:w14="http://schemas.microsoft.com/office/word/2010/wordml" xmlns:w15="http://schemas.microsoft.com/office/word/2012/wordml" xmlns:w16se="http://schemas.microsoft.com/office/word/2015/wordml/symex" xmlns:wpg="http://schemas.microsoft.com/office/word/2010/wordprocessingGroup" xmlns:wpi="http://schemas.microsoft.com/office/word/2010/wordprocessingInk" xmlns:wne="http://schemas.microsoft.com/office/word/2006/wordml" xmlns:wps="http://schemas.microsoft.com/office/word/2010/wordprocessingShape" mc:Ignorable="w14 w15 w16se wp14">
+  <w:abstractNum w:abstractNumId="0" w15:restartNumberingAfterBreak="0">
+    <w:nsid w:val="4F262129"/>
+    <w:multiLevelType w:val="hybridMultilevel"/>
+    <w:tmpl w:val="2FF63C32"/>
+    <w:lvl w:ilvl="0" w:tplc="67FA6AF8">
+      <w:start w:val="1"/>
+      <w:numFmt w:val="decimal"/>
+      <w:lvlText w:val="%1."/>
+      <w:lvlJc w:val="left"/>
+      <w:pPr>
+        <w:ind w:left="360" w:hanging="360"/>
+      </w:pPr>
+      <w:rPr>
+        <w:rFonts w:hint="default"/>
+      </w:rPr>
+    </w:lvl>
+    <w:lvl w:ilvl="1" w:tplc="04090019" w:tentative="1">
+      <w:start w:val="1"/>
+      <w:numFmt w:val="ideographTraditional"/>
+      <w:lvlText w:val="%2、"/>
+      <w:lvlJc w:val="left"/>
+      <w:pPr>
+        <w:ind w:left="960" w:hanging="480"/>
+      </w:pPr>
+    </w:lvl>
+    <w:lvl w:ilvl="2" w:tplc="0409001B" w:tentative="1">
+      <w:start w:val="1"/>
+      <w:numFmt w:val="lowerRoman"/>
+      <w:lvlText w:val="%3."/>
+      <w:lvlJc w:val="right"/>
+      <w:pPr>
+        <w:ind w:left="1440" w:hanging="480"/>
+      </w:pPr>
+    </w:lvl>
+    <w:lvl w:ilvl="3" w:tplc="0409000F" w:tentative="1">
+      <w:start w:val="1"/>
+      <w:numFmt w:val="decimal"/>
+      <w:lvlText w:val="%4."/>
+      <w:lvlJc w:val="left"/>
+      <w:pPr>
+        <w:ind w:left="1920" w:hanging="480"/>
+      </w:pPr>
+    </w:lvl>
+    <w:lvl w:ilvl="4" w:tplc="04090019" w:tentative="1">
+      <w:start w:val="1"/>
+      <w:numFmt w:val="ideographTraditional"/>
+      <w:lvlText w:val="%5、"/>
+      <w:lvlJc w:val="left"/>
+      <w:pPr>
+        <w:ind w:left="2400" w:hanging="480"/>
+      </w:pPr>
+    </w:lvl>
+    <w:lvl w:ilvl="5" w:tplc="0409001B" w:tentative="1">
+      <w:start w:val="1"/>
+      <w:numFmt w:val="lowerRoman"/>
+      <w:lvlText w:val="%6."/>
+      <w:lvlJc w:val="right"/>
+      <w:pPr>
+        <w:ind w:left="2880" w:hanging="480"/>
+      </w:pPr>
+    </w:lvl>
+    <w:lvl w:ilvl="6" w:tplc="0409000F" w:tentative="1">
+      <w:start w:val="1"/>
+      <w:numFmt w:val="decimal"/>
+      <w:lvlText w:val="%7."/>
+      <w:lvlJc w:val="left"/>
+      <w:pPr>
+        <w:ind w:left="3360" w:hanging="480"/>
+      </w:pPr>
+    </w:lvl>
+    <w:lvl w:ilvl="7" w:tplc="04090019" w:tentative="1">
+      <w:start w:val="1"/>
+      <w:numFmt w:val="ideographTraditional"/>
+      <w:lvlText w:val="%8、"/>
+      <w:lvlJc w:val="left"/>
+      <w:pPr>
+        <w:ind w:left="3840" w:hanging="480"/>
+      </w:pPr>
+    </w:lvl>
+    <w:lvl w:ilvl="8" w:tplc="0409001B" w:tentative="1">
+      <w:start w:val="1"/>
+      <w:numFmt w:val="lowerRoman"/>
+      <w:lvlText w:val="%9."/>
+      <w:lvlJc w:val="right"/>
+      <w:pPr>
+        <w:ind w:left="4320" w:hanging="480"/>
+      </w:pPr>
+    </w:lvl>
+  </w:abstractNum>
+  <w:abstractNum w:abstractNumId="1" w15:restartNumberingAfterBreak="0">
+    <w:nsid w:val="7A1C67BB"/>
+    <w:multiLevelType w:val="hybridMultilevel"/>
+    <w:tmpl w:val="FD7AF322"/>
+    <w:lvl w:ilvl="0" w:tplc="01EE76FC">
+      <w:start w:val="1"/>
+      <w:numFmt w:val="decimal"/>
+      <w:lvlText w:val="%1."/>
+      <w:lvlJc w:val="left"/>
+      <w:pPr>
+        <w:ind w:left="360" w:hanging="360"/>
+      </w:pPr>
+      <w:rPr>
+        <w:rFonts w:hint="default"/>
+      </w:rPr>
+    </w:lvl>
+    <w:lvl w:ilvl="1" w:tplc="04090019" w:tentative="1">
+      <w:start w:val="1"/>
+      <w:numFmt w:val="ideographTraditional"/>
+      <w:lvlText w:val="%2、"/>
+      <w:lvlJc w:val="left"/>
+      <w:pPr>
+        <w:ind w:left="960" w:hanging="480"/>
+      </w:pPr>
+    </w:lvl>
+    <w:lvl w:ilvl="2" w:tplc="0409001B" w:tentative="1">
+      <w:start w:val="1"/>
+      <w:numFmt w:val="lowerRoman"/>
+      <w:lvlText w:val="%3."/>
+      <w:lvlJc w:val="right"/>
+      <w:pPr>
+        <w:ind w:left="1440" w:hanging="480"/>
+      </w:pPr>
+    </w:lvl>
+    <w:lvl w:ilvl="3" w:tplc="0409000F" w:tentative="1">
+      <w:start w:val="1"/>
+      <w:numFmt w:val="decimal"/>
+      <w:lvlText w:val="%4."/>
+      <w:lvlJc w:val="left"/>
+      <w:pPr>
+        <w:ind w:left="1920" w:hanging="480"/>
+      </w:pPr>
+    </w:lvl>
+    <w:lvl w:ilvl="4" w:tplc="04090019" w:tentative="1">
+      <w:start w:val="1"/>
+      <w:numFmt w:val="ideographTraditional"/>
+      <w:lvlText w:val="%5、"/>
+      <w:lvlJc w:val="left"/>
+      <w:pPr>
+        <w:ind w:left="2400" w:hanging="480"/>
+      </w:pPr>
+    </w:lvl>
+    <w:lvl w:ilvl="5" w:tplc="0409001B" w:tentative="1">
+      <w:start w:val="1"/>
+      <w:numFmt w:val="lowerRoman"/>
+      <w:lvlText w:val="%6."/>
+      <w:lvlJc w:val="right"/>
+      <w:pPr>
+        <w:ind w:left="2880" w:hanging="480"/>
+      </w:pPr>
+    </w:lvl>
+    <w:lvl w:ilvl="6" w:tplc="0409000F" w:tentative="1">
+      <w:start w:val="1"/>
+      <w:numFmt w:val="decimal"/>
+      <w:lvlText w:val="%7."/>
+      <w:lvlJc w:val="left"/>
+      <w:pPr>
+        <w:ind w:left="3360" w:hanging="480"/>
+      </w:pPr>
+    </w:lvl>
+    <w:lvl w:ilvl="7" w:tplc="04090019" w:tentative="1">
+      <w:start w:val="1"/>
+      <w:numFmt w:val="ideographTraditional"/>
+      <w:lvlText w:val="%8、"/>
+      <w:lvlJc w:val="left"/>
+      <w:pPr>
+        <w:ind w:left="3840" w:hanging="480"/>
+      </w:pPr>
+    </w:lvl>
+    <w:lvl w:ilvl="8" w:tplc="0409001B" w:tentative="1">
+      <w:start w:val="1"/>
+      <w:numFmt w:val="lowerRoman"/>
+      <w:lvlText w:val="%9."/>
+      <w:lvlJc w:val="right"/>
+      <w:pPr>
+        <w:ind w:left="4320" w:hanging="480"/>
+      </w:pPr>
+    </w:lvl>
+  </w:abstractNum>
+  <w:num w:numId="1">
+    <w:abstractNumId w:val="1"/>
+  </w:num>
+  <w:num w:numId="2">
+    <w:abstractNumId w:val="0"/>
+  </w:num>
+</w:numbering>
 </file>
 
 <file path=word/styles.xml><?xml version="1.0" encoding="utf-8"?>
@@ -460,10 +1963,12 @@
   <w:style w:type="paragraph" w:default="1" w:styleId="a">
     <w:name w:val="Normal"/>
     <w:qFormat/>
-    <w:rsid w:val="00C829D3"/>
     <w:pPr>
       <w:widowControl w:val="0"/>
     </w:pPr>
+    <w:rPr>
+      <w:sz w:val="20"/>
+    </w:rPr>
   </w:style>
   <w:style w:type="character" w:default="1" w:styleId="a0">
     <w:name w:val="Default Paragraph Font"/>
@@ -492,26 +1997,31 @@
     <w:semiHidden/>
     <w:unhideWhenUsed/>
   </w:style>
-  <w:style w:type="paragraph" w:styleId="a3">
-    <w:name w:val="Plain Text"/>
+  <w:style w:type="table" w:styleId="a3">
+    <w:name w:val="Table Grid"/>
+    <w:basedOn w:val="a1"/>
+    <w:uiPriority w:val="39"/>
+    <w:rsid w:val="00FE23C5"/>
+    <w:tblPr>
+      <w:tblBorders>
+        <w:top w:val="single" w:sz="4" w:space="0" w:color="auto"/>
+        <w:left w:val="single" w:sz="4" w:space="0" w:color="auto"/>
+        <w:bottom w:val="single" w:sz="4" w:space="0" w:color="auto"/>
+        <w:right w:val="single" w:sz="4" w:space="0" w:color="auto"/>
+        <w:insideH w:val="single" w:sz="4" w:space="0" w:color="auto"/>
+        <w:insideV w:val="single" w:sz="4" w:space="0" w:color="auto"/>
+      </w:tblBorders>
+    </w:tblPr>
+  </w:style>
+  <w:style w:type="paragraph" w:styleId="a4">
+    <w:name w:val="List Paragraph"/>
     <w:basedOn w:val="a"/>
-    <w:link w:val="a4"/>
-    <w:uiPriority w:val="99"/>
-    <w:unhideWhenUsed/>
-    <w:rsid w:val="00D77352"/>
-    <w:rPr>
-      <w:rFonts w:ascii="細明體" w:eastAsia="細明體" w:hAnsi="Courier New" w:cs="Courier New"/>
-    </w:rPr>
-  </w:style>
-  <w:style w:type="character" w:customStyle="1" w:styleId="a4">
-    <w:name w:val="純文字 字元"/>
-    <w:basedOn w:val="a0"/>
-    <w:link w:val="a3"/>
-    <w:uiPriority w:val="99"/>
-    <w:rsid w:val="00D77352"/>
-    <w:rPr>
-      <w:rFonts w:ascii="細明體" w:eastAsia="細明體" w:hAnsi="Courier New" w:cs="Courier New"/>
-    </w:rPr>
+    <w:uiPriority w:val="34"/>
+    <w:qFormat/>
+    <w:rsid w:val="00FE23C5"/>
+    <w:pPr>
+      <w:ind w:leftChars="200" w:left="480"/>
+    </w:pPr>
   </w:style>
   <w:style w:type="paragraph" w:styleId="a5">
     <w:name w:val="header"/>
@@ -519,7 +2029,7 @@
     <w:link w:val="a6"/>
     <w:uiPriority w:val="99"/>
     <w:unhideWhenUsed/>
-    <w:rsid w:val="0033631E"/>
+    <w:rsid w:val="002C0710"/>
     <w:pPr>
       <w:tabs>
         <w:tab w:val="center" w:pos="4153"/>
@@ -537,7 +2047,7 @@
     <w:basedOn w:val="a0"/>
     <w:link w:val="a5"/>
     <w:uiPriority w:val="99"/>
-    <w:rsid w:val="0033631E"/>
+    <w:rsid w:val="002C0710"/>
     <w:rPr>
       <w:sz w:val="20"/>
       <w:szCs w:val="20"/>
@@ -549,7 +2059,7 @@
     <w:link w:val="a8"/>
     <w:uiPriority w:val="99"/>
     <w:unhideWhenUsed/>
-    <w:rsid w:val="0033631E"/>
+    <w:rsid w:val="002C0710"/>
     <w:pPr>
       <w:tabs>
         <w:tab w:val="center" w:pos="4153"/>
@@ -567,29 +2077,32 @@
     <w:basedOn w:val="a0"/>
     <w:link w:val="a7"/>
     <w:uiPriority w:val="99"/>
-    <w:rsid w:val="0033631E"/>
+    <w:rsid w:val="002C0710"/>
     <w:rPr>
       <w:sz w:val="20"/>
       <w:szCs w:val="20"/>
     </w:rPr>
   </w:style>
-  <w:style w:type="character" w:styleId="a9">
-    <w:name w:val="Hyperlink"/>
+  <w:style w:type="paragraph" w:styleId="a9">
+    <w:name w:val="Date"/>
+    <w:basedOn w:val="a"/>
+    <w:next w:val="a"/>
+    <w:link w:val="aa"/>
+    <w:uiPriority w:val="99"/>
+    <w:semiHidden/>
+    <w:unhideWhenUsed/>
+    <w:rsid w:val="0095306F"/>
+    <w:pPr>
+      <w:jc w:val="right"/>
+    </w:pPr>
+  </w:style>
+  <w:style w:type="character" w:customStyle="1" w:styleId="aa">
+    <w:name w:val="日期 字元"/>
     <w:basedOn w:val="a0"/>
+    <w:link w:val="a9"/>
     <w:uiPriority w:val="99"/>
-    <w:unhideWhenUsed/>
-    <w:rsid w:val="0033631E"/>
-    <w:rPr>
-      <w:color w:val="0563C1" w:themeColor="hyperlink"/>
-      <w:u w:val="single"/>
-    </w:rPr>
-  </w:style>
-  <w:style w:type="character" w:customStyle="1" w:styleId="SectionLabel">
-    <w:name w:val="SectionLabel"/>
-    <w:rPr>
-      <w:rFonts w:eastAsia="新細明體"/>
-      <w:color w:val="0000FF"/>
-    </w:rPr>
+    <w:semiHidden/>
+    <w:rsid w:val="0095306F"/>
   </w:style>
 </w:styles>
 </file>
@@ -602,7 +2115,7 @@
         <a:sysClr val="windowText" lastClr="000000"/>
       </a:dk1>
       <a:lt1>
-        <a:sysClr val="window" lastClr="C7EDCC"/>
+        <a:sysClr val="window" lastClr="FFFFFF"/>
       </a:lt1>
       <a:dk2>
         <a:srgbClr val="44546A"/>
@@ -638,7 +2151,7 @@
     <a:fontScheme name="Office">
       <a:majorFont>
         <a:latin typeface="Calibri Light" panose="020F0302020204030204"/>
-        <a:ea typeface="新細明體"/>
+        <a:ea typeface=""/>
         <a:cs typeface=""/>
         <a:font script="Jpan" typeface="游ゴシック Light"/>
         <a:font script="Hang" typeface="맑은 고딕"/>
@@ -673,7 +2186,7 @@
       </a:majorFont>
       <a:minorFont>
         <a:latin typeface="Calibri" panose="020F0502020204030204"/>
-        <a:ea typeface="新細明體"/>
+        <a:ea typeface=""/>
         <a:cs typeface=""/>
         <a:font script="Jpan" typeface="游明朝"/>
         <a:font script="Hang" typeface="맑은 고딕"/>

</xml_diff>

<commit_message>
Make review rows dynamic
</commit_message>
<xml_diff>
--- a/templates/review_template.docx
+++ b/templates/review_template.docx
@@ -278,10 +278,22 @@
             <w:tcW w:w="804" w:type="dxa"/>
           </w:tcPr>
           <w:p>
-            <w:r>
-              <w:rPr>
-                <w:sz w:val="20"/>
-              </w:rPr>
+            <w:pPr>
+              <w:rPr>
+                <w:rFonts w:hint="eastAsia"/>
+                <w:sz w:val="20"/>
+                <w:szCs w:val="20"/>
+              </w:rPr>
+            </w:pPr>
+            <w:r>
+              <w:rPr>
+                <w:rFonts w:hint="eastAsia"/>
+                <w:b/>
+                <w:color w:val="00B050"/>
+                <w:sz w:val="20"/>
+                <w:szCs w:val="20"/>
+              </w:rPr>
+              <w:t>日期</w:t>
             </w:r>
           </w:p>
         </w:tc>
@@ -290,10 +302,52 @@
             <w:tcW w:w="1979" w:type="dxa"/>
           </w:tcPr>
           <w:p>
-            <w:r>
-              <w:rPr>
-                <w:sz w:val="20"/>
-              </w:rPr>
+            <w:pPr>
+              <w:rPr>
+                <w:rFonts w:hint="eastAsia"/>
+                <w:sz w:val="20"/>
+                <w:szCs w:val="20"/>
+              </w:rPr>
+            </w:pPr>
+            <w:r>
+              <w:rPr>
+                <w:rFonts w:hint="eastAsia"/>
+                <w:b/>
+                <w:color w:val="00B050"/>
+                <w:sz w:val="20"/>
+                <w:szCs w:val="20"/>
+              </w:rPr>
+              <w:t>(</w:t>
+            </w:r>
+            <w:r>
+              <w:rPr>
+                <w:rFonts w:hint="eastAsia"/>
+                <w:b/>
+                <w:color w:val="00B050"/>
+                <w:sz w:val="20"/>
+                <w:szCs w:val="20"/>
+              </w:rPr>
+              <w:t>例行</w:t>
+            </w:r>
+            <w:r>
+              <w:rPr>
+                <w:rFonts w:hint="eastAsia"/>
+                <w:b/>
+                <w:color w:val="00B050"/>
+                <w:sz w:val="20"/>
+                <w:szCs w:val="20"/>
+              </w:rPr>
+              <w:t>)</w:t>
+            </w:r>
+            <w:r>
+              <w:rPr>
+                <w:rFonts w:hint="eastAsia"/>
+                <w:b/>
+                <w:color w:val="00B050"/>
+                <w:sz w:val="20"/>
+                <w:szCs w:val="20"/>
+              </w:rPr>
+              <w:t>字幕審稿</w:t>
             </w:r>
           </w:p>
         </w:tc>
@@ -302,11 +356,12 @@
             <w:tcW w:w="3024" w:type="dxa"/>
           </w:tcPr>
           <w:p>
-            <w:r>
-              <w:rPr>
-                <w:sz w:val="20"/>
-              </w:rPr>
-            </w:r>
+            <w:pPr>
+              <w:rPr>
+                <w:sz w:val="20"/>
+                <w:szCs w:val="20"/>
+              </w:rPr>
+            </w:pPr>
           </w:p>
         </w:tc>
         <w:tc>
@@ -314,11 +369,12 @@
             <w:tcW w:w="2410" w:type="dxa"/>
           </w:tcPr>
           <w:p>
-            <w:r>
-              <w:rPr>
-                <w:sz w:val="20"/>
-              </w:rPr>
-            </w:r>
+            <w:pPr>
+              <w:rPr>
+                <w:sz w:val="20"/>
+                <w:szCs w:val="20"/>
+              </w:rPr>
+            </w:pPr>
           </w:p>
         </w:tc>
       </w:tr>
@@ -378,10 +434,24 @@
             <w:tcW w:w="804" w:type="dxa"/>
           </w:tcPr>
           <w:p>
-            <w:r>
-              <w:rPr>
-                <w:sz w:val="20"/>
-              </w:rPr>
+            <w:pPr>
+              <w:rPr>
+                <w:rFonts w:hint="eastAsia"/>
+                <w:b/>
+                <w:color w:val="FF0000"/>
+                <w:sz w:val="20"/>
+                <w:szCs w:val="20"/>
+              </w:rPr>
+            </w:pPr>
+            <w:r>
+              <w:rPr>
+                <w:rFonts w:hint="eastAsia"/>
+                <w:b/>
+                <w:color w:val="FF0000"/>
+                <w:sz w:val="20"/>
+                <w:szCs w:val="20"/>
+              </w:rPr>
+              <w:t>日期</w:t>
             </w:r>
           </w:p>
         </w:tc>
@@ -390,10 +460,24 @@
             <w:tcW w:w="1979" w:type="dxa"/>
           </w:tcPr>
           <w:p>
-            <w:r>
-              <w:rPr>
-                <w:sz w:val="20"/>
-              </w:rPr>
+            <w:pPr>
+              <w:rPr>
+                <w:rFonts w:hint="eastAsia"/>
+                <w:b/>
+                <w:color w:val="FF0000"/>
+                <w:sz w:val="20"/>
+                <w:szCs w:val="20"/>
+              </w:rPr>
+            </w:pPr>
+            <w:r>
+              <w:rPr>
+                <w:rFonts w:hint="eastAsia"/>
+                <w:b/>
+                <w:color w:val="FF0000"/>
+                <w:sz w:val="20"/>
+                <w:szCs w:val="20"/>
+              </w:rPr>
+              <w:t>臨時工作</w:t>
             </w:r>
           </w:p>
         </w:tc>
@@ -402,11 +486,12 @@
             <w:tcW w:w="3024" w:type="dxa"/>
           </w:tcPr>
           <w:p>
-            <w:r>
-              <w:rPr>
-                <w:sz w:val="20"/>
-              </w:rPr>
-            </w:r>
+            <w:pPr>
+              <w:rPr>
+                <w:sz w:val="20"/>
+                <w:szCs w:val="20"/>
+              </w:rPr>
+            </w:pPr>
           </w:p>
         </w:tc>
         <w:tc>
@@ -414,11 +499,12 @@
             <w:tcW w:w="2410" w:type="dxa"/>
           </w:tcPr>
           <w:p>
-            <w:r>
-              <w:rPr>
-                <w:sz w:val="20"/>
-              </w:rPr>
-            </w:r>
+            <w:pPr>
+              <w:rPr>
+                <w:sz w:val="20"/>
+                <w:szCs w:val="20"/>
+              </w:rPr>
+            </w:pPr>
           </w:p>
         </w:tc>
       </w:tr>
@@ -428,22 +514,10 @@
             <w:tcW w:w="804" w:type="dxa"/>
           </w:tcPr>
           <w:p>
-            <w:pPr>
-              <w:rPr>
-                <w:rFonts w:hint="eastAsia"/>
-                <w:sz w:val="20"/>
-                <w:szCs w:val="20"/>
-              </w:rPr>
-            </w:pPr>
-            <w:r>
-              <w:rPr>
-                <w:rFonts w:hint="eastAsia"/>
-                <w:b/>
-                <w:color w:val="00B050"/>
-                <w:sz w:val="20"/>
-                <w:szCs w:val="20"/>
-              </w:rPr>
-              <w:t>日期</w:t>
+            <w:r>
+              <w:rPr>
+                <w:sz w:val="20"/>
+              </w:rPr>
             </w:r>
           </w:p>
         </w:tc>
@@ -452,52 +526,10 @@
             <w:tcW w:w="1979" w:type="dxa"/>
           </w:tcPr>
           <w:p>
-            <w:pPr>
-              <w:rPr>
-                <w:rFonts w:hint="eastAsia"/>
-                <w:sz w:val="20"/>
-                <w:szCs w:val="20"/>
-              </w:rPr>
-            </w:pPr>
-            <w:r>
-              <w:rPr>
-                <w:rFonts w:hint="eastAsia"/>
-                <w:b/>
-                <w:color w:val="00B050"/>
-                <w:sz w:val="20"/>
-                <w:szCs w:val="20"/>
-              </w:rPr>
-              <w:t>(</w:t>
-            </w:r>
-            <w:r>
-              <w:rPr>
-                <w:rFonts w:hint="eastAsia"/>
-                <w:b/>
-                <w:color w:val="00B050"/>
-                <w:sz w:val="20"/>
-                <w:szCs w:val="20"/>
-              </w:rPr>
-              <w:t>例行</w:t>
-            </w:r>
-            <w:r>
-              <w:rPr>
-                <w:rFonts w:hint="eastAsia"/>
-                <w:b/>
-                <w:color w:val="00B050"/>
-                <w:sz w:val="20"/>
-                <w:szCs w:val="20"/>
-              </w:rPr>
-              <w:t>)</w:t>
-            </w:r>
-            <w:r>
-              <w:rPr>
-                <w:rFonts w:hint="eastAsia"/>
-                <w:b/>
-                <w:color w:val="00B050"/>
-                <w:sz w:val="20"/>
-                <w:szCs w:val="20"/>
-              </w:rPr>
-              <w:t>字幕審稿</w:t>
+            <w:r>
+              <w:rPr>
+                <w:sz w:val="20"/>
+              </w:rPr>
             </w:r>
           </w:p>
         </w:tc>
@@ -506,12 +538,11 @@
             <w:tcW w:w="3024" w:type="dxa"/>
           </w:tcPr>
           <w:p>
-            <w:pPr>
-              <w:rPr>
-                <w:sz w:val="20"/>
-                <w:szCs w:val="20"/>
-              </w:rPr>
-            </w:pPr>
+            <w:r>
+              <w:rPr>
+                <w:sz w:val="20"/>
+              </w:rPr>
+            </w:r>
           </w:p>
         </w:tc>
         <w:tc>
@@ -519,61 +550,68 @@
             <w:tcW w:w="2410" w:type="dxa"/>
           </w:tcPr>
           <w:p>
-            <w:pPr>
-              <w:rPr>
-                <w:sz w:val="20"/>
-                <w:szCs w:val="20"/>
-              </w:rPr>
-            </w:pPr>
+            <w:r>
+              <w:rPr>
+                <w:sz w:val="20"/>
+              </w:rPr>
+            </w:r>
           </w:p>
         </w:tc>
       </w:tr>
       <w:tr>
         <w:tc>
           <w:tcPr>
-            <w:tcW w:w="804" w:type="dxa"/>
-          </w:tcPr>
-          <w:p>
-            <w:r>
-              <w:rPr>
-                <w:sz w:val="20"/>
-              </w:rPr>
-            </w:r>
-          </w:p>
-        </w:tc>
-        <w:tc>
-          <w:tcPr>
-            <w:tcW w:w="1979" w:type="dxa"/>
-          </w:tcPr>
-          <w:p>
-            <w:r>
-              <w:rPr>
-                <w:sz w:val="20"/>
-              </w:rPr>
-            </w:r>
-          </w:p>
-        </w:tc>
-        <w:tc>
-          <w:tcPr>
-            <w:tcW w:w="3024" w:type="dxa"/>
-          </w:tcPr>
-          <w:p>
-            <w:r>
-              <w:rPr>
-                <w:sz w:val="20"/>
-              </w:rPr>
-            </w:r>
-          </w:p>
-        </w:tc>
-        <w:tc>
-          <w:tcPr>
-            <w:tcW w:w="2410" w:type="dxa"/>
-          </w:tcPr>
-          <w:p>
-            <w:r>
-              <w:rPr>
-                <w:sz w:val="20"/>
-              </w:rPr>
+            <w:tcW w:w="8217" w:type="dxa"/>
+            <w:gridSpan w:val="4"/>
+          </w:tcPr>
+          <w:p>
+            <w:r>
+              <w:rPr>
+                <w:sz w:val="20"/>
+              </w:rPr>
+              <w:t>本月工作心得:</w:t>
+            </w:r>
+          </w:p>
+          <w:p/>
+          <w:p/>
+          <w:p>
+            <w:r>
+              <w:rPr>
+                <w:sz w:val="20"/>
+              </w:rPr>
+              <w:t>工作亮點:</w:t>
+            </w:r>
+          </w:p>
+          <w:p>
+            <w:r>
+              <w:rPr>
+                <w:sz w:val="20"/>
+              </w:rPr>
+              <w:t>健忘次數與事項:</w:t>
+            </w:r>
+          </w:p>
+          <w:p>
+            <w:r>
+              <w:rPr>
+                <w:sz w:val="20"/>
+              </w:rPr>
+              <w:t>特休假:</w:t>
+            </w:r>
+          </w:p>
+          <w:p>
+            <w:r>
+              <w:rPr>
+                <w:sz w:val="20"/>
+              </w:rPr>
+              <w:t>同心圓會議:</w:t>
+            </w:r>
+          </w:p>
+          <w:p>
+            <w:r>
+              <w:rPr>
+                <w:sz w:val="20"/>
+              </w:rPr>
+              <w:t>部門內部會議:</w:t>
             </w:r>
           </w:p>
         </w:tc>
@@ -581,49 +619,138 @@
       <w:tr>
         <w:tc>
           <w:tcPr>
-            <w:tcW w:w="804" w:type="dxa"/>
-          </w:tcPr>
-          <w:p>
-            <w:r>
-              <w:rPr>
-                <w:sz w:val="20"/>
-              </w:rPr>
-            </w:r>
-          </w:p>
-        </w:tc>
-        <w:tc>
-          <w:tcPr>
-            <w:tcW w:w="1979" w:type="dxa"/>
-          </w:tcPr>
-          <w:p>
-            <w:r>
-              <w:rPr>
-                <w:sz w:val="20"/>
-              </w:rPr>
-            </w:r>
-          </w:p>
-        </w:tc>
-        <w:tc>
-          <w:tcPr>
-            <w:tcW w:w="3024" w:type="dxa"/>
-          </w:tcPr>
-          <w:p>
-            <w:r>
-              <w:rPr>
-                <w:sz w:val="20"/>
-              </w:rPr>
-            </w:r>
-          </w:p>
-        </w:tc>
-        <w:tc>
-          <w:tcPr>
-            <w:tcW w:w="2410" w:type="dxa"/>
-          </w:tcPr>
-          <w:p>
-            <w:r>
-              <w:rPr>
-                <w:sz w:val="20"/>
-              </w:rPr>
+            <w:tcW w:w="8217" w:type="dxa"/>
+            <w:gridSpan w:val="4"/>
+          </w:tcPr>
+          <w:p>
+            <w:r>
+              <w:rPr>
+                <w:rStyle w:val="SectionLabelSmall"/>
+              </w:rPr>
+              <w:t>本月總翻譯時數(字幕): (影片長度總和 非工作時數)</w:t>
+            </w:r>
+          </w:p>
+          <w:p>
+            <w:r>
+              <w:rPr>
+                <w:sz w:val="20"/>
+              </w:rPr>
+              <w:t>中翻英:</w:t>
+            </w:r>
+          </w:p>
+          <w:p>
+            <w:r>
+              <w:rPr>
+                <w:sz w:val="20"/>
+              </w:rPr>
+              <w:t>英翻中:</w:t>
+            </w:r>
+          </w:p>
+          <w:p/>
+          <w:p>
+            <w:r>
+              <w:rPr>
+                <w:rStyle w:val="SectionLabelSmall"/>
+              </w:rPr>
+              <w:t>本月總審稿時數(字幕): (影片長度總和 非工作時數)</w:t>
+            </w:r>
+          </w:p>
+          <w:p>
+            <w:r>
+              <w:rPr>
+                <w:sz w:val="20"/>
+              </w:rPr>
+              <w:t>中翻英:</w:t>
+            </w:r>
+          </w:p>
+          <w:p>
+            <w:r>
+              <w:rPr>
+                <w:sz w:val="20"/>
+              </w:rPr>
+              <w:t>英翻中:</w:t>
+            </w:r>
+          </w:p>
+          <w:p/>
+          <w:p>
+            <w:r>
+              <w:rPr>
+                <w:rStyle w:val="SectionLabelSmall"/>
+              </w:rPr>
+              <w:t>其他工作:</w:t>
+            </w:r>
+          </w:p>
+          <w:p>
+            <w:r>
+              <w:rPr>
+                <w:sz w:val="20"/>
+              </w:rPr>
+              <w:t>定稿標題簡介縮圖:</w:t>
+            </w:r>
+          </w:p>
+          <w:p>
+            <w:r>
+              <w:rPr>
+                <w:sz w:val="20"/>
+              </w:rPr>
+              <w:t>寫IG:</w:t>
+            </w:r>
+          </w:p>
+          <w:p>
+            <w:r>
+              <w:rPr>
+                <w:sz w:val="20"/>
+              </w:rPr>
+              <w:t>LW edit:</w:t>
+            </w:r>
+          </w:p>
+          <w:p>
+            <w:r>
+              <w:rPr>
+                <w:sz w:val="20"/>
+              </w:rPr>
+              <w:t>小編文:</w:t>
+            </w:r>
+          </w:p>
+          <w:p>
+            <w:r>
+              <w:rPr>
+                <w:sz w:val="20"/>
+              </w:rPr>
+              <w:t>節目上網:</w:t>
+            </w:r>
+          </w:p>
+          <w:p>
+            <w:r>
+              <w:rPr>
+                <w:sz w:val="20"/>
+              </w:rPr>
+              <w:t>製作QA/Quote:</w:t>
+            </w:r>
+          </w:p>
+          <w:p>
+            <w:r>
+              <w:rPr>
+                <w:sz w:val="20"/>
+              </w:rPr>
+              <w:t>節錄經典:</w:t>
+            </w:r>
+          </w:p>
+          <w:p/>
+          <w:p>
+            <w:r>
+              <w:rPr>
+                <w:rStyle w:val="SectionLabelSmall"/>
+              </w:rPr>
+              <w:t>行政工作:</w:t>
+            </w:r>
+          </w:p>
+          <w:p>
+            <w:r>
+              <w:rPr>
+                <w:sz w:val="20"/>
+              </w:rPr>
+              <w:t>PM選稿子:</w:t>
             </w:r>
           </w:p>
         </w:tc>
@@ -631,49 +758,15 @@
       <w:tr>
         <w:tc>
           <w:tcPr>
-            <w:tcW w:w="804" w:type="dxa"/>
-          </w:tcPr>
-          <w:p>
-            <w:r>
-              <w:rPr>
-                <w:sz w:val="20"/>
-              </w:rPr>
-            </w:r>
-          </w:p>
-        </w:tc>
-        <w:tc>
-          <w:tcPr>
-            <w:tcW w:w="1979" w:type="dxa"/>
-          </w:tcPr>
-          <w:p>
-            <w:r>
-              <w:rPr>
-                <w:sz w:val="20"/>
-              </w:rPr>
-            </w:r>
-          </w:p>
-        </w:tc>
-        <w:tc>
-          <w:tcPr>
-            <w:tcW w:w="3024" w:type="dxa"/>
-          </w:tcPr>
-          <w:p>
-            <w:r>
-              <w:rPr>
-                <w:sz w:val="20"/>
-              </w:rPr>
-            </w:r>
-          </w:p>
-        </w:tc>
-        <w:tc>
-          <w:tcPr>
-            <w:tcW w:w="2410" w:type="dxa"/>
-          </w:tcPr>
-          <w:p>
-            <w:r>
-              <w:rPr>
-                <w:sz w:val="20"/>
-              </w:rPr>
+            <w:tcW w:w="8217" w:type="dxa"/>
+            <w:gridSpan w:val="4"/>
+          </w:tcPr>
+          <w:p>
+            <w:r>
+              <w:rPr>
+                <w:sz w:val="20"/>
+              </w:rPr>
+              <w:t>之前工作紀錄</w:t>
             </w:r>
           </w:p>
         </w:tc>
@@ -685,10 +778,10 @@
           </w:tcPr>
           <w:p>
             <w:pPr>
-              <w:rPr>
-                <w:rFonts w:hint="eastAsia"/>
-                <w:b/>
-                <w:color w:val="FF0000"/>
+              <w:jc w:val="center"/>
+              <w:rPr>
+                <w:b/>
+                <w:color w:val="00B050"/>
                 <w:sz w:val="20"/>
                 <w:szCs w:val="20"/>
               </w:rPr>
@@ -697,7 +790,7 @@
               <w:rPr>
                 <w:rFonts w:hint="eastAsia"/>
                 <w:b/>
-                <w:color w:val="FF0000"/>
+                <w:color w:val="00B050"/>
                 <w:sz w:val="20"/>
                 <w:szCs w:val="20"/>
               </w:rPr>
@@ -708,373 +801,6 @@
         <w:tc>
           <w:tcPr>
             <w:tcW w:w="1979" w:type="dxa"/>
-          </w:tcPr>
-          <w:p>
-            <w:pPr>
-              <w:rPr>
-                <w:rFonts w:hint="eastAsia"/>
-                <w:b/>
-                <w:color w:val="FF0000"/>
-                <w:sz w:val="20"/>
-                <w:szCs w:val="20"/>
-              </w:rPr>
-            </w:pPr>
-            <w:r>
-              <w:rPr>
-                <w:rFonts w:hint="eastAsia"/>
-                <w:b/>
-                <w:color w:val="FF0000"/>
-                <w:sz w:val="20"/>
-                <w:szCs w:val="20"/>
-              </w:rPr>
-              <w:t>臨時工作</w:t>
-            </w:r>
-          </w:p>
-        </w:tc>
-        <w:tc>
-          <w:tcPr>
-            <w:tcW w:w="3024" w:type="dxa"/>
-          </w:tcPr>
-          <w:p>
-            <w:pPr>
-              <w:rPr>
-                <w:sz w:val="20"/>
-                <w:szCs w:val="20"/>
-              </w:rPr>
-            </w:pPr>
-          </w:p>
-        </w:tc>
-        <w:tc>
-          <w:tcPr>
-            <w:tcW w:w="2410" w:type="dxa"/>
-          </w:tcPr>
-          <w:p>
-            <w:pPr>
-              <w:rPr>
-                <w:sz w:val="20"/>
-                <w:szCs w:val="20"/>
-              </w:rPr>
-            </w:pPr>
-          </w:p>
-        </w:tc>
-      </w:tr>
-      <w:tr>
-        <w:tc>
-          <w:tcPr>
-            <w:tcW w:w="804" w:type="dxa"/>
-          </w:tcPr>
-          <w:p>
-            <w:r>
-              <w:rPr>
-                <w:sz w:val="20"/>
-              </w:rPr>
-            </w:r>
-          </w:p>
-        </w:tc>
-        <w:tc>
-          <w:tcPr>
-            <w:tcW w:w="1979" w:type="dxa"/>
-          </w:tcPr>
-          <w:p>
-            <w:r>
-              <w:rPr>
-                <w:sz w:val="20"/>
-              </w:rPr>
-            </w:r>
-          </w:p>
-        </w:tc>
-        <w:tc>
-          <w:tcPr>
-            <w:tcW w:w="3024" w:type="dxa"/>
-          </w:tcPr>
-          <w:p>
-            <w:r>
-              <w:rPr>
-                <w:sz w:val="20"/>
-              </w:rPr>
-            </w:r>
-          </w:p>
-        </w:tc>
-        <w:tc>
-          <w:tcPr>
-            <w:tcW w:w="2410" w:type="dxa"/>
-          </w:tcPr>
-          <w:p>
-            <w:r>
-              <w:rPr>
-                <w:sz w:val="20"/>
-              </w:rPr>
-            </w:r>
-          </w:p>
-        </w:tc>
-      </w:tr>
-      <w:tr>
-        <w:tc>
-          <w:tcPr>
-            <w:tcW w:w="804" w:type="dxa"/>
-          </w:tcPr>
-          <w:p>
-            <w:r>
-              <w:rPr>
-                <w:sz w:val="20"/>
-              </w:rPr>
-            </w:r>
-          </w:p>
-        </w:tc>
-        <w:tc>
-          <w:tcPr>
-            <w:tcW w:w="1979" w:type="dxa"/>
-          </w:tcPr>
-          <w:p>
-            <w:r>
-              <w:rPr>
-                <w:sz w:val="20"/>
-              </w:rPr>
-            </w:r>
-          </w:p>
-        </w:tc>
-        <w:tc>
-          <w:tcPr>
-            <w:tcW w:w="3024" w:type="dxa"/>
-          </w:tcPr>
-          <w:p>
-            <w:r>
-              <w:rPr>
-                <w:sz w:val="20"/>
-              </w:rPr>
-            </w:r>
-          </w:p>
-        </w:tc>
-        <w:tc>
-          <w:tcPr>
-            <w:tcW w:w="2410" w:type="dxa"/>
-          </w:tcPr>
-          <w:p>
-            <w:r>
-              <w:rPr>
-                <w:sz w:val="20"/>
-              </w:rPr>
-            </w:r>
-          </w:p>
-        </w:tc>
-      </w:tr>
-      <w:tr>
-        <w:tc>
-          <w:tcPr>
-            <w:tcW w:w="8217" w:type="dxa"/>
-            <w:gridSpan w:val="4"/>
-          </w:tcPr>
-          <w:p>
-            <w:r>
-              <w:rPr>
-                <w:sz w:val="20"/>
-              </w:rPr>
-              <w:t>本月工作心得:</w:t>
-            </w:r>
-          </w:p>
-          <w:p/>
-          <w:p/>
-          <w:p>
-            <w:r>
-              <w:rPr>
-                <w:sz w:val="20"/>
-              </w:rPr>
-              <w:t>工作亮點:</w:t>
-            </w:r>
-          </w:p>
-          <w:p>
-            <w:r>
-              <w:rPr>
-                <w:sz w:val="20"/>
-              </w:rPr>
-              <w:t>健忘次數與事項:</w:t>
-            </w:r>
-          </w:p>
-          <w:p>
-            <w:r>
-              <w:rPr>
-                <w:sz w:val="20"/>
-              </w:rPr>
-              <w:t>特休假:</w:t>
-            </w:r>
-          </w:p>
-          <w:p>
-            <w:r>
-              <w:rPr>
-                <w:sz w:val="20"/>
-              </w:rPr>
-              <w:t>同心圓會議:</w:t>
-            </w:r>
-          </w:p>
-          <w:p>
-            <w:r>
-              <w:rPr>
-                <w:sz w:val="20"/>
-              </w:rPr>
-              <w:t>部門內部會議:</w:t>
-            </w:r>
-          </w:p>
-        </w:tc>
-      </w:tr>
-      <w:tr>
-        <w:tc>
-          <w:tcPr>
-            <w:tcW w:w="8217" w:type="dxa"/>
-            <w:gridSpan w:val="4"/>
-          </w:tcPr>
-          <w:p>
-            <w:r>
-              <w:rPr>
-                <w:rStyle w:val="SectionLabelSmall"/>
-              </w:rPr>
-              <w:t>本月總翻譯時數(字幕): (影片長度總和 非工作時數)</w:t>
-            </w:r>
-          </w:p>
-          <w:p>
-            <w:r>
-              <w:rPr>
-                <w:sz w:val="20"/>
-              </w:rPr>
-              <w:t>中翻英:</w:t>
-            </w:r>
-          </w:p>
-          <w:p>
-            <w:r>
-              <w:rPr>
-                <w:sz w:val="20"/>
-              </w:rPr>
-              <w:t>英翻中:</w:t>
-            </w:r>
-          </w:p>
-          <w:p/>
-          <w:p>
-            <w:r>
-              <w:rPr>
-                <w:rStyle w:val="SectionLabelSmall"/>
-              </w:rPr>
-              <w:t>本月總審稿時數(字幕): (影片長度總和 非工作時數)</w:t>
-            </w:r>
-          </w:p>
-          <w:p>
-            <w:r>
-              <w:rPr>
-                <w:sz w:val="20"/>
-              </w:rPr>
-              <w:t>中翻英:</w:t>
-            </w:r>
-          </w:p>
-          <w:p>
-            <w:r>
-              <w:rPr>
-                <w:sz w:val="20"/>
-              </w:rPr>
-              <w:t>英翻中:</w:t>
-            </w:r>
-          </w:p>
-          <w:p/>
-          <w:p>
-            <w:r>
-              <w:rPr>
-                <w:rStyle w:val="SectionLabelSmall"/>
-              </w:rPr>
-              <w:t>其他工作:</w:t>
-            </w:r>
-          </w:p>
-          <w:p>
-            <w:r>
-              <w:rPr>
-                <w:sz w:val="20"/>
-              </w:rPr>
-              <w:t>定稿標題簡介縮圖:</w:t>
-            </w:r>
-          </w:p>
-          <w:p>
-            <w:r>
-              <w:rPr>
-                <w:sz w:val="20"/>
-              </w:rPr>
-              <w:t>寫IG:</w:t>
-            </w:r>
-          </w:p>
-          <w:p>
-            <w:r>
-              <w:rPr>
-                <w:sz w:val="20"/>
-              </w:rPr>
-              <w:t>LW edit:</w:t>
-            </w:r>
-          </w:p>
-          <w:p>
-            <w:r>
-              <w:rPr>
-                <w:sz w:val="20"/>
-              </w:rPr>
-              <w:t>小編文:</w:t>
-            </w:r>
-          </w:p>
-          <w:p>
-            <w:r>
-              <w:rPr>
-                <w:sz w:val="20"/>
-              </w:rPr>
-              <w:t>節目上網:</w:t>
-            </w:r>
-          </w:p>
-          <w:p>
-            <w:r>
-              <w:rPr>
-                <w:sz w:val="20"/>
-              </w:rPr>
-              <w:t>製作QA/Quote:</w:t>
-            </w:r>
-          </w:p>
-          <w:p>
-            <w:r>
-              <w:rPr>
-                <w:sz w:val="20"/>
-              </w:rPr>
-              <w:t>節錄經典:</w:t>
-            </w:r>
-          </w:p>
-          <w:p/>
-          <w:p>
-            <w:r>
-              <w:rPr>
-                <w:rStyle w:val="SectionLabelSmall"/>
-              </w:rPr>
-              <w:t>行政工作:</w:t>
-            </w:r>
-          </w:p>
-          <w:p>
-            <w:r>
-              <w:rPr>
-                <w:sz w:val="20"/>
-              </w:rPr>
-              <w:t>PM選稿子:</w:t>
-            </w:r>
-          </w:p>
-        </w:tc>
-      </w:tr>
-      <w:tr>
-        <w:tc>
-          <w:tcPr>
-            <w:tcW w:w="8217" w:type="dxa"/>
-            <w:gridSpan w:val="4"/>
-          </w:tcPr>
-          <w:p>
-            <w:r>
-              <w:rPr>
-                <w:sz w:val="20"/>
-              </w:rPr>
-              <w:t>之前工作紀錄</w:t>
-            </w:r>
-          </w:p>
-        </w:tc>
-      </w:tr>
-      <w:tr>
-        <w:tc>
-          <w:tcPr>
-            <w:tcW w:w="804" w:type="dxa"/>
           </w:tcPr>
           <w:p>
             <w:pPr>
@@ -1094,13 +820,13 @@
                 <w:sz w:val="20"/>
                 <w:szCs w:val="20"/>
               </w:rPr>
-              <w:t>日期</w:t>
-            </w:r>
-          </w:p>
-        </w:tc>
-        <w:tc>
-          <w:tcPr>
-            <w:tcW w:w="1979" w:type="dxa"/>
+              <w:t>工作項目</w:t>
+            </w:r>
+          </w:p>
+        </w:tc>
+        <w:tc>
+          <w:tcPr>
+            <w:tcW w:w="3024" w:type="dxa"/>
           </w:tcPr>
           <w:p>
             <w:pPr>
@@ -1120,13 +846,13 @@
                 <w:sz w:val="20"/>
                 <w:szCs w:val="20"/>
               </w:rPr>
-              <w:t>工作項目</w:t>
-            </w:r>
-          </w:p>
-        </w:tc>
-        <w:tc>
-          <w:tcPr>
-            <w:tcW w:w="3024" w:type="dxa"/>
+              <w:t>編輯回饋</w:t>
+            </w:r>
+          </w:p>
+        </w:tc>
+        <w:tc>
+          <w:tcPr>
+            <w:tcW w:w="2410" w:type="dxa"/>
           </w:tcPr>
           <w:p>
             <w:pPr>
@@ -1146,133 +872,7 @@
                 <w:sz w:val="20"/>
                 <w:szCs w:val="20"/>
               </w:rPr>
-              <w:t>編輯回饋</w:t>
-            </w:r>
-          </w:p>
-        </w:tc>
-        <w:tc>
-          <w:tcPr>
-            <w:tcW w:w="2410" w:type="dxa"/>
-          </w:tcPr>
-          <w:p>
-            <w:pPr>
-              <w:jc w:val="center"/>
-              <w:rPr>
-                <w:b/>
-                <w:color w:val="00B050"/>
-                <w:sz w:val="20"/>
-                <w:szCs w:val="20"/>
-              </w:rPr>
-            </w:pPr>
-            <w:r>
-              <w:rPr>
-                <w:rFonts w:hint="eastAsia"/>
-                <w:b/>
-                <w:color w:val="00B050"/>
-                <w:sz w:val="20"/>
-                <w:szCs w:val="20"/>
-              </w:rPr>
               <w:t>主管回饋</w:t>
-            </w:r>
-          </w:p>
-        </w:tc>
-      </w:tr>
-      <w:tr>
-        <w:tc>
-          <w:tcPr>
-            <w:tcW w:w="804" w:type="dxa"/>
-          </w:tcPr>
-          <w:p>
-            <w:r>
-              <w:rPr>
-                <w:sz w:val="20"/>
-              </w:rPr>
-            </w:r>
-          </w:p>
-        </w:tc>
-        <w:tc>
-          <w:tcPr>
-            <w:tcW w:w="1979" w:type="dxa"/>
-          </w:tcPr>
-          <w:p>
-            <w:r>
-              <w:rPr>
-                <w:sz w:val="20"/>
-              </w:rPr>
-            </w:r>
-          </w:p>
-        </w:tc>
-        <w:tc>
-          <w:tcPr>
-            <w:tcW w:w="3024" w:type="dxa"/>
-          </w:tcPr>
-          <w:p>
-            <w:r>
-              <w:rPr>
-                <w:sz w:val="20"/>
-              </w:rPr>
-            </w:r>
-          </w:p>
-        </w:tc>
-        <w:tc>
-          <w:tcPr>
-            <w:tcW w:w="2410" w:type="dxa"/>
-          </w:tcPr>
-          <w:p>
-            <w:r>
-              <w:rPr>
-                <w:sz w:val="20"/>
-              </w:rPr>
-            </w:r>
-          </w:p>
-        </w:tc>
-      </w:tr>
-      <w:tr>
-        <w:tc>
-          <w:tcPr>
-            <w:tcW w:w="804" w:type="dxa"/>
-          </w:tcPr>
-          <w:p>
-            <w:r>
-              <w:rPr>
-                <w:sz w:val="20"/>
-              </w:rPr>
-            </w:r>
-          </w:p>
-        </w:tc>
-        <w:tc>
-          <w:tcPr>
-            <w:tcW w:w="1979" w:type="dxa"/>
-          </w:tcPr>
-          <w:p>
-            <w:r>
-              <w:rPr>
-                <w:sz w:val="20"/>
-              </w:rPr>
-            </w:r>
-          </w:p>
-        </w:tc>
-        <w:tc>
-          <w:tcPr>
-            <w:tcW w:w="3024" w:type="dxa"/>
-          </w:tcPr>
-          <w:p>
-            <w:r>
-              <w:rPr>
-                <w:sz w:val="20"/>
-              </w:rPr>
-            </w:r>
-          </w:p>
-        </w:tc>
-        <w:tc>
-          <w:tcPr>
-            <w:tcW w:w="2410" w:type="dxa"/>
-          </w:tcPr>
-          <w:p>
-            <w:r>
-              <w:rPr>
-                <w:sz w:val="20"/>
-              </w:rPr>
             </w:r>
           </w:p>
         </w:tc>

</xml_diff>

<commit_message>
Add notes-only feedback and posts rows
</commit_message>
<xml_diff>
--- a/templates/review_template.docx
+++ b/templates/review_template.docx
@@ -623,134 +623,286 @@
             <w:gridSpan w:val="4"/>
           </w:tcPr>
           <w:p>
+            <w:pPr>
+              <w:pStyle w:val="Normal"/>
+              <w:spacing w:before="0" w:after="0"/>
+              <w:jc w:val="start"/>
+              <w:rPr>
+                <w:rFonts w:ascii="Calibri" w:hAnsi="Calibri" w:eastAsia="新細明體" w:cs=""/>
+                <w:kern w:val="2"/>
+                <w:szCs w:val="22"/>
+                <w:lang w:val="en-US" w:eastAsia="zh-TW" w:bidi="ar-SA"/>
+              </w:rPr>
+            </w:pPr>
             <w:r>
               <w:rPr>
                 <w:rStyle w:val="SectionLabelSmall"/>
-              </w:rPr>
-              <w:t>本月總翻譯時數(字幕): (影片長度總和 非工作時數)</w:t>
-            </w:r>
-          </w:p>
-          <w:p>
-            <w:r>
-              <w:rPr>
-                <w:sz w:val="20"/>
-              </w:rPr>
-              <w:t>中翻英:</w:t>
-            </w:r>
-          </w:p>
-          <w:p>
-            <w:r>
-              <w:rPr>
-                <w:sz w:val="20"/>
-              </w:rPr>
-              <w:t>英翻中:</w:t>
-            </w:r>
-          </w:p>
-          <w:p/>
-          <w:p>
+                <w:rFonts w:ascii="Calibri" w:hAnsi="Calibri" w:cs=""/>
+                <w:kern w:val="2"/>
+                <w:szCs w:val="22"/>
+                <w:lang w:val="en-US" w:eastAsia="zh-TW" w:bidi="ar-SA"/>
+              </w:rPr>
+              <w:t>本月總翻譯時數</w:t>
+            </w:r>
             <w:r>
               <w:rPr>
                 <w:rStyle w:val="SectionLabelSmall"/>
-              </w:rPr>
-              <w:t>本月總審稿時數(字幕): (影片長度總和 非工作時數)</w:t>
-            </w:r>
-          </w:p>
-          <w:p>
-            <w:r>
-              <w:rPr>
-                <w:sz w:val="20"/>
-              </w:rPr>
-              <w:t>中翻英:</w:t>
-            </w:r>
-          </w:p>
-          <w:p>
-            <w:r>
-              <w:rPr>
-                <w:sz w:val="20"/>
-              </w:rPr>
-              <w:t>英翻中:</w:t>
-            </w:r>
-          </w:p>
-          <w:p/>
-          <w:p>
+                <w:rFonts w:eastAsia="新細明體" w:cs=""/>
+                <w:kern w:val="2"/>
+                <w:szCs w:val="22"/>
+                <w:lang w:val="en-US" w:eastAsia="zh-TW" w:bidi="ar-SA"/>
+              </w:rPr>
+              <w:t>(</w:t>
+            </w:r>
             <w:r>
               <w:rPr>
                 <w:rStyle w:val="SectionLabelSmall"/>
-              </w:rPr>
-              <w:t>其他工作:</w:t>
-            </w:r>
-          </w:p>
-          <w:p>
-            <w:r>
-              <w:rPr>
-                <w:sz w:val="20"/>
-              </w:rPr>
-              <w:t>定稿標題簡介縮圖:</w:t>
-            </w:r>
-          </w:p>
-          <w:p>
-            <w:r>
-              <w:rPr>
-                <w:sz w:val="20"/>
-              </w:rPr>
-              <w:t>寫IG:</w:t>
-            </w:r>
-          </w:p>
-          <w:p>
-            <w:r>
-              <w:rPr>
-                <w:sz w:val="20"/>
-              </w:rPr>
-              <w:t>LW edit:</w:t>
-            </w:r>
-          </w:p>
-          <w:p>
-            <w:r>
-              <w:rPr>
-                <w:sz w:val="20"/>
-              </w:rPr>
-              <w:t>小編文:</w:t>
-            </w:r>
-          </w:p>
-          <w:p>
-            <w:r>
-              <w:rPr>
-                <w:sz w:val="20"/>
-              </w:rPr>
-              <w:t>節目上網:</w:t>
-            </w:r>
-          </w:p>
-          <w:p>
-            <w:r>
-              <w:rPr>
-                <w:sz w:val="20"/>
-              </w:rPr>
-              <w:t>製作QA/Quote:</w:t>
-            </w:r>
-          </w:p>
-          <w:p>
-            <w:r>
-              <w:rPr>
-                <w:sz w:val="20"/>
-              </w:rPr>
-              <w:t>節錄經典:</w:t>
-            </w:r>
-          </w:p>
-          <w:p/>
-          <w:p>
+                <w:rFonts w:ascii="Calibri" w:hAnsi="Calibri" w:cs=""/>
+                <w:kern w:val="2"/>
+                <w:szCs w:val="22"/>
+                <w:lang w:val="en-US" w:eastAsia="zh-TW" w:bidi="ar-SA"/>
+              </w:rPr>
+              <w:t>字幕</w:t>
+            </w:r>
             <w:r>
               <w:rPr>
                 <w:rStyle w:val="SectionLabelSmall"/>
-              </w:rPr>
-              <w:t>行政工作:</w:t>
-            </w:r>
-          </w:p>
-          <w:p>
-            <w:r>
-              <w:rPr>
-                <w:sz w:val="20"/>
-              </w:rPr>
-              <w:t>PM選稿子:</w:t>
+                <w:rFonts w:eastAsia="新細明體" w:cs=""/>
+                <w:kern w:val="2"/>
+                <w:szCs w:val="22"/>
+                <w:lang w:val="en-US" w:eastAsia="zh-TW" w:bidi="ar-SA"/>
+              </w:rPr>
+              <w:t>): (</w:t>
+            </w:r>
+            <w:r>
+              <w:rPr>
+                <w:rStyle w:val="SectionLabelSmall"/>
+                <w:rFonts w:ascii="Calibri" w:hAnsi="Calibri" w:cs=""/>
+                <w:kern w:val="2"/>
+                <w:szCs w:val="22"/>
+                <w:lang w:val="en-US" w:eastAsia="zh-TW" w:bidi="ar-SA"/>
+              </w:rPr>
+              <w:t>影片長度總和非工作時數</w:t>
+            </w:r>
+            <w:r>
+              <w:rPr>
+                <w:rStyle w:val="SectionLabelSmall"/>
+                <w:rFonts w:eastAsia="新細明體" w:cs=""/>
+                <w:kern w:val="2"/>
+                <w:szCs w:val="22"/>
+                <w:lang w:val="en-US" w:eastAsia="zh-TW" w:bidi="ar-SA"/>
+              </w:rPr>
+              <w:t>)</w:t>
+            </w:r>
+          </w:p>
+          <w:p>
+            <w:pPr>
+              <w:pStyle w:val="Normal"/>
+              <w:spacing w:before="0" w:after="0"/>
+              <w:jc w:val="start"/>
+              <w:rPr>
+                <w:rFonts w:ascii="Calibri" w:hAnsi="Calibri" w:eastAsia="新細明體" w:cs=""/>
+                <w:kern w:val="2"/>
+                <w:szCs w:val="22"/>
+                <w:lang w:val="en-US" w:eastAsia="zh-TW" w:bidi="ar-SA"/>
+              </w:rPr>
+            </w:pPr>
+            <w:r>
+              <w:t>長度:</w:t>
+            </w:r>
+          </w:p>
+          <w:p>
+            <w:pPr>
+              <w:pStyle w:val="Normal"/>
+              <w:spacing w:before="0" w:after="0"/>
+              <w:jc w:val="start"/>
+              <w:rPr>
+                <w:rFonts w:ascii="Calibri" w:hAnsi="Calibri" w:eastAsia="新細明體" w:cs=""/>
+                <w:kern w:val="2"/>
+                <w:szCs w:val="22"/>
+                <w:lang w:val="en-US" w:eastAsia="zh-TW" w:bidi="ar-SA"/>
+              </w:rPr>
+            </w:pPr>
+            <w:r>
+              <w:rPr>
+                <w:rFonts w:eastAsia="新細明體" w:cs=""/>
+                <w:kern w:val="2"/>
+                <w:szCs w:val="22"/>
+                <w:lang w:val="en-US" w:eastAsia="zh-TW" w:bidi="ar-SA"/>
+              </w:rPr>
+            </w:r>
+          </w:p>
+          <w:p>
+            <w:pPr>
+              <w:pStyle w:val="Normal"/>
+              <w:spacing w:before="0" w:after="0"/>
+              <w:jc w:val="start"/>
+              <w:rPr>
+                <w:color w:val="0070C0"/>
+                <w:sz w:val="20"/>
+                <w:szCs w:val="20"/>
+              </w:rPr>
+            </w:pPr>
+            <w:r>
+              <w:rPr>
+                <w:rFonts w:ascii="Calibri" w:hAnsi="Calibri" w:cs="" w:hint="eastAsia"/>
+                <w:color w:val="0070C0"/>
+                <w:kern w:val="2"/>
+                <w:sz w:val="20"/>
+                <w:szCs w:val="20"/>
+                <w:lang w:val="en-US" w:eastAsia="zh-TW" w:bidi="ar-SA"/>
+              </w:rPr>
+              <w:t>其他工作</w:t>
+            </w:r>
+            <w:r>
+              <w:rPr>
+                <w:rFonts w:eastAsia="新細明體" w:cs="" w:hint="eastAsia"/>
+                <w:color w:val="0070C0"/>
+                <w:kern w:val="2"/>
+                <w:sz w:val="20"/>
+                <w:szCs w:val="20"/>
+                <w:lang w:val="en-US" w:eastAsia="zh-TW" w:bidi="ar-SA"/>
+              </w:rPr>
+              <w:t>:</w:t>
+            </w:r>
+          </w:p>
+          <w:p>
+            <w:pPr>
+              <w:pStyle w:val="Normal"/>
+              <w:spacing w:before="0" w:after="0"/>
+              <w:jc w:val="start"/>
+              <w:rPr>
+                <w:sz w:val="20"/>
+                <w:szCs w:val="20"/>
+              </w:rPr>
+            </w:pPr>
+            <w:r>
+              <w:rPr>
+                <w:rFonts w:ascii="Calibri" w:hAnsi="Calibri" w:cs=""/>
+                <w:kern w:val="2"/>
+                <w:sz w:val="20"/>
+                <w:szCs w:val="20"/>
+                <w:lang w:val="en-US" w:eastAsia="zh-TW" w:bidi="ar-SA"/>
+              </w:rPr>
+              <w:t>英文新聞</w:t>
+            </w:r>
+            <w:r>
+              <w:rPr>
+                <w:rFonts w:eastAsia="新細明體" w:cs=""/>
+                <w:kern w:val="2"/>
+                <w:sz w:val="20"/>
+                <w:szCs w:val="20"/>
+                <w:lang w:val="en-US" w:eastAsia="zh-TW" w:bidi="ar-SA"/>
+              </w:rPr>
+              <w:t>: ?</w:t>
+            </w:r>
+            <w:r>
+              <w:rPr>
+                <w:rFonts w:ascii="Calibri" w:hAnsi="Calibri" w:cs=""/>
+                <w:kern w:val="2"/>
+                <w:sz w:val="20"/>
+                <w:szCs w:val="20"/>
+                <w:lang w:val="en-US" w:eastAsia="zh-TW" w:bidi="ar-SA"/>
+              </w:rPr>
+              <w:t>篇</w:t>
+            </w:r>
+          </w:p>
+          <w:p>
+            <w:pPr>
+              <w:pStyle w:val="Normal"/>
+              <w:spacing w:before="0" w:after="0"/>
+              <w:jc w:val="start"/>
+              <w:rPr>
+                <w:color w:val="0070C0"/>
+                <w:sz w:val="20"/>
+                <w:szCs w:val="20"/>
+              </w:rPr>
+            </w:pPr>
+            <w:r>
+              <w:rPr>
+                <w:rFonts w:eastAsia="新細明體" w:cs="" w:hint="eastAsia"/>
+                <w:color w:val="0070C0"/>
+                <w:kern w:val="2"/>
+                <w:sz w:val="20"/>
+                <w:szCs w:val="20"/>
+                <w:lang w:val="en-US" w:eastAsia="zh-TW" w:bidi="ar-SA"/>
+              </w:rPr>
+            </w:r>
+          </w:p>
+          <w:p>
+            <w:pPr>
+              <w:pStyle w:val="Normal"/>
+              <w:spacing w:before="0" w:after="0"/>
+              <w:jc w:val="start"/>
+              <w:rPr>
+                <w:rFonts w:ascii="Calibri" w:hAnsi="Calibri" w:eastAsia="新細明體" w:cs=""/>
+                <w:kern w:val="2"/>
+                <w:szCs w:val="22"/>
+                <w:lang w:val="en-US" w:eastAsia="zh-TW" w:bidi="ar-SA"/>
+              </w:rPr>
+            </w:pPr>
+            <w:r>
+              <w:rPr>
+                <w:rStyle w:val="SectionLabelSmall"/>
+                <w:rFonts w:ascii="Calibri" w:hAnsi="Calibri" w:cs=""/>
+                <w:kern w:val="2"/>
+                <w:szCs w:val="22"/>
+                <w:lang w:val="en-US" w:eastAsia="zh-TW" w:bidi="ar-SA"/>
+              </w:rPr>
+              <w:t>行政工作</w:t>
+            </w:r>
+            <w:r>
+              <w:rPr>
+                <w:rStyle w:val="SectionLabelSmall"/>
+                <w:rFonts w:eastAsia="新細明體" w:cs=""/>
+                <w:kern w:val="2"/>
+                <w:szCs w:val="22"/>
+                <w:lang w:val="en-US" w:eastAsia="zh-TW" w:bidi="ar-SA"/>
+              </w:rPr>
+              <w:t>:</w:t>
+            </w:r>
+          </w:p>
+          <w:p>
+            <w:pPr>
+              <w:pStyle w:val="Normal"/>
+              <w:spacing w:before="0" w:after="0"/>
+              <w:jc w:val="start"/>
+              <w:rPr>
+                <w:rFonts w:ascii="Calibri" w:hAnsi="Calibri" w:eastAsia="新細明體" w:cs=""/>
+                <w:kern w:val="2"/>
+                <w:szCs w:val="22"/>
+                <w:lang w:val="en-US" w:eastAsia="zh-TW" w:bidi="ar-SA"/>
+              </w:rPr>
+            </w:pPr>
+            <w:r>
+              <w:rPr>
+                <w:rFonts w:eastAsia="新細明體" w:cs=""/>
+                <w:kern w:val="2"/>
+                <w:sz w:val="20"/>
+                <w:szCs w:val="22"/>
+                <w:lang w:val="en-US" w:eastAsia="zh-TW" w:bidi="ar-SA"/>
+              </w:rPr>
+              <w:t>PM</w:t>
+            </w:r>
+            <w:r>
+              <w:rPr>
+                <w:rFonts w:ascii="Calibri" w:hAnsi="Calibri" w:cs=""/>
+                <w:kern w:val="2"/>
+                <w:sz w:val="20"/>
+                <w:szCs w:val="22"/>
+                <w:lang w:val="en-US" w:eastAsia="zh-TW" w:bidi="ar-SA"/>
+              </w:rPr>
+              <w:t>選稿子</w:t>
+            </w:r>
+            <w:r>
+              <w:rPr>
+                <w:rFonts w:eastAsia="新細明體" w:cs=""/>
+                <w:kern w:val="2"/>
+                <w:sz w:val="20"/>
+                <w:szCs w:val="22"/>
+                <w:lang w:val="en-US" w:eastAsia="zh-TW" w:bidi="ar-SA"/>
+              </w:rPr>
+              <w:t>:</w:t>
             </w:r>
           </w:p>
         </w:tc>

</xml_diff>

<commit_message>
Update review template document
</commit_message>
<xml_diff>
--- a/templates/review_template.docx
+++ b/templates/review_template.docx
@@ -575,12 +575,7 @@
           <w:p/>
           <w:p/>
           <w:p>
-            <w:r>
-              <w:rPr>
-                <w:sz w:val="20"/>
-              </w:rPr>
-              <w:t>工作亮點:</w:t>
-            </w:r>
+            <w:r/>
           </w:p>
           <w:p>
             <w:r>

</xml_diff>